<commit_message>
adicionado as celulas especiais sempre visiveis , hover na coluna
</commit_message>
<xml_diff>
--- a/public/Relatorio_Final_LS.docx
+++ b/public/Relatorio_Final_LS.docx
@@ -891,18 +891,7 @@
                   <w:lang w:val="pt-PT"/>
                 </w:rPr>
                 <w:tab/>
-                <w:t>LEI 20221</w:t>
-              </w:r>
-              <w:r>
-                <w:rPr>
-                  <w:rFonts w:ascii="Arial" w:hAnsi="Arial" w:cs="Arial"/>
-                  <w:b/>
-                  <w:bCs/>
-                  <w:sz w:val="28"/>
-                  <w:szCs w:val="28"/>
-                  <w:lang w:val="pt-PT"/>
-                </w:rPr>
-                <w:t>27235</w:t>
+                <w:t>LEI 2022127235</w:t>
               </w:r>
             </w:p>
             <w:p>
@@ -1060,8 +1049,9 @@
           <w:lang w:val="pt-PT"/>
         </w:rPr>
         <w:sectPr>
-          <w:headerReference w:type="default" r:id="rId11"/>
-          <w:footerReference w:type="first" r:id="rId12"/>
+          <w:headerReference w:type="even" r:id="rId11"/>
+          <w:headerReference w:type="default" r:id="rId12"/>
+          <w:footerReference w:type="first" r:id="rId13"/>
           <w:type w:val="continuous"/>
           <w:pgSz w:w="11906" w:h="16838"/>
           <w:pgMar w:top="709" w:right="849" w:bottom="0" w:left="3828" w:header="0" w:footer="0" w:gutter="0"/>
@@ -1127,29 +1117,868 @@
         <w:pStyle w:val="Ttulo2"/>
         <w:numPr>
           <w:ilvl w:val="0"/>
+          <w:numId w:val="0"/>
+        </w:numPr>
+        <w:ind w:firstLine="720"/>
+        <w:rPr>
+          <w:noProof/>
+          <w:lang w:val="pt-PT"/>
+        </w:rPr>
+      </w:pPr>
+      <w:bookmarkStart w:id="3" w:name="_Ref165039009"/>
+      <w:r>
+        <w:rPr>
+          <w:noProof/>
+          <w:lang w:val="pt-PT"/>
+        </w:rPr>
+        <w:lastRenderedPageBreak/>
+        <w:t>I</w:t>
+      </w:r>
+      <w:r>
+        <w:rPr>
+          <w:noProof/>
+          <w:lang w:val="pt-PT"/>
+        </w:rPr>
+        <w:t>magens</w:t>
+      </w:r>
+    </w:p>
+    <w:p>
+      <w:pPr>
+        <w:pStyle w:val="Corpodetexto"/>
+        <w:ind w:left="720"/>
+        <w:rPr>
+          <w:lang w:val="pt-PT"/>
+        </w:rPr>
+      </w:pPr>
+      <w:r>
+        <w:rPr>
+          <w:noProof/>
+        </w:rPr>
+        <w:drawing>
+          <wp:inline distT="0" distB="0" distL="0" distR="0" wp14:anchorId="526CFF9D" wp14:editId="78009335">
+            <wp:extent cx="5731510" cy="2757805"/>
+            <wp:effectExtent l="0" t="0" r="2540" b="4445"/>
+            <wp:docPr id="1014202290" name="Imagem 1" descr="Uma imagem com texto, captura de ecrã, software, Sistema operativo&#10;&#10;Os conteúdos gerados por IA poderão estar incorretos."/>
+            <wp:cNvGraphicFramePr>
+              <a:graphicFrameLocks xmlns:a="http://schemas.openxmlformats.org/drawingml/2006/main" noChangeAspect="1"/>
+            </wp:cNvGraphicFramePr>
+            <a:graphic xmlns:a="http://schemas.openxmlformats.org/drawingml/2006/main">
+              <a:graphicData uri="http://schemas.openxmlformats.org/drawingml/2006/picture">
+                <pic:pic xmlns:pic="http://schemas.openxmlformats.org/drawingml/2006/picture">
+                  <pic:nvPicPr>
+                    <pic:cNvPr id="1014202290" name="Imagem 1" descr="Uma imagem com texto, captura de ecrã, software, Sistema operativo&#10;&#10;Os conteúdos gerados por IA poderão estar incorretos."/>
+                    <pic:cNvPicPr/>
+                  </pic:nvPicPr>
+                  <pic:blipFill>
+                    <a:blip r:embed="rId14" cstate="print">
+                      <a:extLst>
+                        <a:ext uri="{28A0092B-C50C-407E-A947-70E740481C1C}">
+                          <a14:useLocalDpi xmlns:a14="http://schemas.microsoft.com/office/drawing/2010/main" val="0"/>
+                        </a:ext>
+                      </a:extLst>
+                    </a:blip>
+                    <a:stretch>
+                      <a:fillRect/>
+                    </a:stretch>
+                  </pic:blipFill>
+                  <pic:spPr>
+                    <a:xfrm>
+                      <a:off x="0" y="0"/>
+                      <a:ext cx="5731510" cy="2757805"/>
+                    </a:xfrm>
+                    <a:prstGeom prst="rect">
+                      <a:avLst/>
+                    </a:prstGeom>
+                  </pic:spPr>
+                </pic:pic>
+              </a:graphicData>
+            </a:graphic>
+          </wp:inline>
+        </w:drawing>
+      </w:r>
+    </w:p>
+    <w:p>
+      <w:pPr>
+        <w:pStyle w:val="Legenda"/>
+        <w:ind w:left="720"/>
+        <w:rPr>
+          <w:lang w:val="pt-PT"/>
+        </w:rPr>
+      </w:pPr>
+      <w:r>
+        <w:rPr>
+          <w:lang w:val="pt-PT"/>
+        </w:rPr>
+        <w:t xml:space="preserve">Figura </w:t>
+      </w:r>
+      <w:r>
+        <w:fldChar w:fldCharType="begin"/>
+      </w:r>
+      <w:r>
+        <w:rPr>
+          <w:lang w:val="pt-PT"/>
+        </w:rPr>
+        <w:instrText xml:space="preserve"> SEQ Figura \* ARABIC </w:instrText>
+      </w:r>
+      <w:r>
+        <w:fldChar w:fldCharType="separate"/>
+      </w:r>
+      <w:r>
+        <w:rPr>
+          <w:noProof/>
+          <w:lang w:val="pt-PT"/>
+        </w:rPr>
+        <w:t>1</w:t>
+      </w:r>
+      <w:r>
+        <w:fldChar w:fldCharType="end"/>
+      </w:r>
+      <w:r>
+        <w:rPr>
+          <w:lang w:val="pt-PT"/>
+        </w:rPr>
+        <w:t xml:space="preserve"> – </w:t>
+      </w:r>
+      <w:proofErr w:type="spellStart"/>
+      <w:r>
+        <w:rPr>
+          <w:lang w:val="pt-PT"/>
+        </w:rPr>
+        <w:t>HomePage</w:t>
+      </w:r>
+      <w:proofErr w:type="spellEnd"/>
+    </w:p>
+    <w:p>
+      <w:pPr>
+        <w:pStyle w:val="Corpodetexto"/>
+        <w:ind w:left="720"/>
+        <w:rPr>
+          <w:lang w:val="pt-PT"/>
+        </w:rPr>
+      </w:pPr>
+    </w:p>
+    <w:p>
+      <w:pPr>
+        <w:pStyle w:val="Corpodetexto"/>
+        <w:keepNext/>
+        <w:ind w:left="720"/>
+      </w:pPr>
+      <w:r>
+        <w:rPr>
+          <w:noProof/>
+        </w:rPr>
+        <w:drawing>
+          <wp:inline distT="0" distB="0" distL="0" distR="0" wp14:anchorId="503CE5DF" wp14:editId="4B4B7EB1">
+            <wp:extent cx="5731510" cy="2512060"/>
+            <wp:effectExtent l="0" t="0" r="2540" b="2540"/>
+            <wp:docPr id="508192368" name="Imagem 1" descr="Uma imagem com texto, captura de ecrã, software, Sistema operativo&#10;&#10;Os conteúdos gerados por IA poderão estar incorretos."/>
+            <wp:cNvGraphicFramePr>
+              <a:graphicFrameLocks xmlns:a="http://schemas.openxmlformats.org/drawingml/2006/main" noChangeAspect="1"/>
+            </wp:cNvGraphicFramePr>
+            <a:graphic xmlns:a="http://schemas.openxmlformats.org/drawingml/2006/main">
+              <a:graphicData uri="http://schemas.openxmlformats.org/drawingml/2006/picture">
+                <pic:pic xmlns:pic="http://schemas.openxmlformats.org/drawingml/2006/picture">
+                  <pic:nvPicPr>
+                    <pic:cNvPr id="508192368" name="Imagem 1" descr="Uma imagem com texto, captura de ecrã, software, Sistema operativo&#10;&#10;Os conteúdos gerados por IA poderão estar incorretos."/>
+                    <pic:cNvPicPr/>
+                  </pic:nvPicPr>
+                  <pic:blipFill>
+                    <a:blip r:embed="rId15"/>
+                    <a:stretch>
+                      <a:fillRect/>
+                    </a:stretch>
+                  </pic:blipFill>
+                  <pic:spPr>
+                    <a:xfrm>
+                      <a:off x="0" y="0"/>
+                      <a:ext cx="5731510" cy="2512060"/>
+                    </a:xfrm>
+                    <a:prstGeom prst="rect">
+                      <a:avLst/>
+                    </a:prstGeom>
+                  </pic:spPr>
+                </pic:pic>
+              </a:graphicData>
+            </a:graphic>
+          </wp:inline>
+        </w:drawing>
+      </w:r>
+    </w:p>
+    <w:p>
+      <w:pPr>
+        <w:pStyle w:val="Legenda"/>
+      </w:pPr>
+      <w:proofErr w:type="spellStart"/>
+      <w:r>
+        <w:t>Figura</w:t>
+      </w:r>
+      <w:proofErr w:type="spellEnd"/>
+      <w:r>
+        <w:t xml:space="preserve"> </w:t>
+      </w:r>
+      <w:fldSimple w:instr=" SEQ Figura \* ARABIC ">
+        <w:r>
+          <w:rPr>
+            <w:noProof/>
+          </w:rPr>
+          <w:t>2</w:t>
+        </w:r>
+      </w:fldSimple>
+      <w:r>
+        <w:t xml:space="preserve"> – Histórico das </w:t>
+      </w:r>
+      <w:proofErr w:type="spellStart"/>
+      <w:r>
+        <w:t>Partidas</w:t>
+      </w:r>
+      <w:proofErr w:type="spellEnd"/>
+    </w:p>
+    <w:p>
+      <w:pPr>
+        <w:pStyle w:val="Corpodetexto"/>
+        <w:keepNext/>
+        <w:jc w:val="center"/>
+      </w:pPr>
+      <w:r>
+        <w:rPr>
+          <w:noProof/>
+        </w:rPr>
+        <w:lastRenderedPageBreak/>
+        <w:drawing>
+          <wp:inline distT="0" distB="0" distL="0" distR="0" wp14:anchorId="10605B56" wp14:editId="5338EDE2">
+            <wp:extent cx="2843973" cy="3648075"/>
+            <wp:effectExtent l="0" t="0" r="0" b="0"/>
+            <wp:docPr id="570166745" name="Imagem 1" descr="Uma imagem com captura de ecrã, texto, Saturação de cores&#10;&#10;Os conteúdos gerados por IA poderão estar incorretos."/>
+            <wp:cNvGraphicFramePr>
+              <a:graphicFrameLocks xmlns:a="http://schemas.openxmlformats.org/drawingml/2006/main" noChangeAspect="1"/>
+            </wp:cNvGraphicFramePr>
+            <a:graphic xmlns:a="http://schemas.openxmlformats.org/drawingml/2006/main">
+              <a:graphicData uri="http://schemas.openxmlformats.org/drawingml/2006/picture">
+                <pic:pic xmlns:pic="http://schemas.openxmlformats.org/drawingml/2006/picture">
+                  <pic:nvPicPr>
+                    <pic:cNvPr id="570166745" name="Imagem 1" descr="Uma imagem com captura de ecrã, texto, Saturação de cores&#10;&#10;Os conteúdos gerados por IA poderão estar incorretos."/>
+                    <pic:cNvPicPr/>
+                  </pic:nvPicPr>
+                  <pic:blipFill>
+                    <a:blip r:embed="rId16"/>
+                    <a:stretch>
+                      <a:fillRect/>
+                    </a:stretch>
+                  </pic:blipFill>
+                  <pic:spPr>
+                    <a:xfrm>
+                      <a:off x="0" y="0"/>
+                      <a:ext cx="2865417" cy="3675582"/>
+                    </a:xfrm>
+                    <a:prstGeom prst="rect">
+                      <a:avLst/>
+                    </a:prstGeom>
+                  </pic:spPr>
+                </pic:pic>
+              </a:graphicData>
+            </a:graphic>
+          </wp:inline>
+        </w:drawing>
+      </w:r>
+    </w:p>
+    <w:p>
+      <w:pPr>
+        <w:pStyle w:val="Legenda"/>
+        <w:rPr>
+          <w:lang w:val="pt-PT"/>
+        </w:rPr>
+      </w:pPr>
+      <w:proofErr w:type="spellStart"/>
+      <w:r>
+        <w:t>Figura</w:t>
+      </w:r>
+      <w:proofErr w:type="spellEnd"/>
+      <w:r>
+        <w:t xml:space="preserve"> </w:t>
+      </w:r>
+      <w:fldSimple w:instr=" SEQ Figura \* ARABIC ">
+        <w:r>
+          <w:rPr>
+            <w:noProof/>
+          </w:rPr>
+          <w:t>3</w:t>
+        </w:r>
+      </w:fldSimple>
+      <w:r>
+        <w:t xml:space="preserve"> – </w:t>
+      </w:r>
+      <w:proofErr w:type="spellStart"/>
+      <w:r>
+        <w:t>Tabuleiro</w:t>
+      </w:r>
+      <w:proofErr w:type="spellEnd"/>
+      <w:r>
+        <w:t xml:space="preserve"> de Jogo</w:t>
+      </w:r>
+    </w:p>
+    <w:p>
+      <w:pPr>
+        <w:pStyle w:val="Corpodetexto"/>
+        <w:rPr>
+          <w:lang w:val="pt-PT"/>
+        </w:rPr>
+      </w:pPr>
+    </w:p>
+    <w:p>
+      <w:pPr>
+        <w:pStyle w:val="Ttulo2"/>
+        <w:numPr>
+          <w:ilvl w:val="0"/>
           <w:numId w:val="23"/>
         </w:numPr>
         <w:rPr>
           <w:lang w:val="pt-PT"/>
         </w:rPr>
       </w:pPr>
-      <w:bookmarkStart w:id="3" w:name="_Ref165039009"/>
+      <w:r>
+        <w:rPr>
+          <w:lang w:val="pt-PT"/>
+        </w:rPr>
+        <w:t>Resumo</w:t>
+      </w:r>
+    </w:p>
+    <w:p>
+      <w:pPr>
+        <w:pStyle w:val="NormalWeb"/>
+        <w:ind w:left="720"/>
+        <w:rPr>
+          <w:rFonts w:ascii="Garamond" w:hAnsi="Garamond"/>
+          <w:sz w:val="28"/>
+          <w:szCs w:val="28"/>
+        </w:rPr>
+      </w:pPr>
+      <w:r>
+        <w:rPr>
+          <w:rFonts w:ascii="Garamond" w:hAnsi="Garamond"/>
+          <w:sz w:val="28"/>
+          <w:szCs w:val="28"/>
+        </w:rPr>
+        <w:t xml:space="preserve">Este trabalho prático tem como objetivo o desenvolvimento de uma aplicação interativa em </w:t>
+      </w:r>
+      <w:proofErr w:type="spellStart"/>
+      <w:r>
+        <w:rPr>
+          <w:rFonts w:ascii="Garamond" w:hAnsi="Garamond"/>
+          <w:sz w:val="28"/>
+          <w:szCs w:val="28"/>
+        </w:rPr>
+        <w:t>React</w:t>
+      </w:r>
+      <w:proofErr w:type="spellEnd"/>
+      <w:r>
+        <w:rPr>
+          <w:rFonts w:ascii="Garamond" w:hAnsi="Garamond"/>
+          <w:sz w:val="28"/>
+          <w:szCs w:val="28"/>
+        </w:rPr>
+        <w:t xml:space="preserve"> JS baseada no jogo “4 em Linha”, com o intuito de aplicar os conhecimentos adquiridos na unidade curricular de Linguagens Script. </w:t>
+      </w:r>
+    </w:p>
+    <w:p>
+      <w:pPr>
+        <w:pStyle w:val="NormalWeb"/>
+        <w:ind w:left="720"/>
+        <w:rPr>
+          <w:rFonts w:ascii="Garamond" w:hAnsi="Garamond"/>
+          <w:sz w:val="28"/>
+          <w:szCs w:val="28"/>
+        </w:rPr>
+      </w:pPr>
+      <w:r>
+        <w:rPr>
+          <w:rFonts w:ascii="Garamond" w:hAnsi="Garamond"/>
+          <w:sz w:val="28"/>
+          <w:szCs w:val="28"/>
+        </w:rPr>
+        <w:t xml:space="preserve">A aplicação deverá demonstrar domínio nas tecnologias essenciais como JavaScript, HTML e CSS, seguindo as boas práticas de desenvolvimento com componentes funcionais em </w:t>
+      </w:r>
+      <w:proofErr w:type="spellStart"/>
+      <w:r>
+        <w:rPr>
+          <w:rFonts w:ascii="Garamond" w:hAnsi="Garamond"/>
+          <w:sz w:val="28"/>
+          <w:szCs w:val="28"/>
+        </w:rPr>
+        <w:t>React</w:t>
+      </w:r>
+      <w:proofErr w:type="spellEnd"/>
+      <w:r>
+        <w:rPr>
+          <w:rFonts w:ascii="Garamond" w:hAnsi="Garamond"/>
+          <w:sz w:val="28"/>
+          <w:szCs w:val="28"/>
+        </w:rPr>
+        <w:t>.</w:t>
+      </w:r>
+    </w:p>
+    <w:p>
+      <w:pPr>
+        <w:pStyle w:val="NormalWeb"/>
+        <w:ind w:left="720"/>
+        <w:rPr>
+          <w:rFonts w:ascii="Garamond" w:hAnsi="Garamond"/>
+          <w:sz w:val="28"/>
+          <w:szCs w:val="28"/>
+        </w:rPr>
+      </w:pPr>
+      <w:r>
+        <w:rPr>
+          <w:rFonts w:ascii="Garamond" w:hAnsi="Garamond"/>
+          <w:sz w:val="28"/>
+          <w:szCs w:val="28"/>
+        </w:rPr>
+        <w:t xml:space="preserve">A solução implementada permite a interação entre dois jogadores ou entre um jogador e o computador, com funcionalidades que incluem a identificação do jogador ativo, temporização de jogadas, jogabilidade com peças animadas, e células especiais que concedem bónus ao jogador. </w:t>
+      </w:r>
+    </w:p>
+    <w:p>
+      <w:pPr>
+        <w:pStyle w:val="NormalWeb"/>
+        <w:ind w:left="720"/>
+        <w:rPr>
+          <w:rFonts w:ascii="Garamond" w:hAnsi="Garamond"/>
+          <w:sz w:val="28"/>
+          <w:szCs w:val="28"/>
+        </w:rPr>
+      </w:pPr>
+      <w:r>
+        <w:rPr>
+          <w:rFonts w:ascii="Garamond" w:hAnsi="Garamond"/>
+          <w:sz w:val="28"/>
+          <w:szCs w:val="28"/>
+        </w:rPr>
+        <w:t>O jogo decorre numa grelha 6x7 e termina quando se verificam quatro peças do mesmo jogador em linha (horizontal, vertical ou diagonal) ou quando todas as posições estão ocupadas.</w:t>
+      </w:r>
+    </w:p>
+    <w:p>
+      <w:pPr>
+        <w:pStyle w:val="NormalWeb"/>
+        <w:ind w:left="720"/>
+        <w:rPr>
+          <w:rFonts w:ascii="Garamond" w:hAnsi="Garamond"/>
+          <w:sz w:val="28"/>
+          <w:szCs w:val="28"/>
+        </w:rPr>
+      </w:pPr>
+      <w:r>
+        <w:rPr>
+          <w:rFonts w:ascii="Garamond" w:hAnsi="Garamond"/>
+          <w:sz w:val="28"/>
+          <w:szCs w:val="28"/>
+        </w:rPr>
+        <w:lastRenderedPageBreak/>
+        <w:t xml:space="preserve">Para além das funcionalidades básicas, foram também implementadas funcionalidades adicionais como: seleção visual de colunas, animação da peça ao ser colocada (deslizamento), </w:t>
+      </w:r>
+      <w:proofErr w:type="spellStart"/>
+      <w:r>
+        <w:rPr>
+          <w:rFonts w:ascii="Garamond" w:hAnsi="Garamond"/>
+          <w:sz w:val="28"/>
+          <w:szCs w:val="28"/>
+        </w:rPr>
+        <w:t>detecção</w:t>
+      </w:r>
+      <w:proofErr w:type="spellEnd"/>
+      <w:r>
+        <w:rPr>
+          <w:rFonts w:ascii="Garamond" w:hAnsi="Garamond"/>
+          <w:sz w:val="28"/>
+          <w:szCs w:val="28"/>
+        </w:rPr>
+        <w:t xml:space="preserve"> do vencedor ou empate, reinício de jogo e destaque das células com bónus. </w:t>
+      </w:r>
+    </w:p>
+    <w:p>
+      <w:pPr>
+        <w:pStyle w:val="NormalWeb"/>
+        <w:ind w:left="720"/>
+        <w:rPr>
+          <w:rFonts w:ascii="Garamond" w:hAnsi="Garamond"/>
+          <w:sz w:val="28"/>
+          <w:szCs w:val="28"/>
+        </w:rPr>
+      </w:pPr>
+      <w:r>
+        <w:rPr>
+          <w:rFonts w:ascii="Garamond" w:hAnsi="Garamond"/>
+          <w:sz w:val="28"/>
+          <w:szCs w:val="28"/>
+        </w:rPr>
+        <w:t>O desenvolvimento foi realizado com foco na organização modular dos componentes e na criação de uma interface visualmente apelativa e funcional, respeitando as diretrizes impostas no enunciado do trabalho.</w:t>
+      </w:r>
+    </w:p>
+    <w:p>
+      <w:pPr>
+        <w:pStyle w:val="Ttulo2"/>
+        <w:numPr>
+          <w:ilvl w:val="0"/>
+          <w:numId w:val="23"/>
+        </w:numPr>
+        <w:rPr>
+          <w:lang w:val="pt-PT"/>
+        </w:rPr>
+      </w:pPr>
+      <w:r>
+        <w:rPr>
+          <w:lang w:val="pt-PT"/>
+        </w:rPr>
+        <w:t>Limitações</w:t>
+      </w:r>
+    </w:p>
+    <w:p>
+      <w:pPr>
+        <w:pStyle w:val="Corpodetexto"/>
+        <w:ind w:left="720"/>
+        <w:jc w:val="left"/>
+        <w:rPr>
+          <w:lang w:val="pt-PT"/>
+        </w:rPr>
+      </w:pPr>
+      <w:r>
+        <w:rPr>
+          <w:lang w:val="pt-PT"/>
+        </w:rPr>
+        <w:t>Durante o desenvolvimento da aplicação, identificaram-se algumas limitações que não foram completamente ultrapassadas na versão final entregue:</w:t>
+      </w:r>
+    </w:p>
+    <w:p>
+      <w:pPr>
+        <w:pStyle w:val="Corpodetexto"/>
+        <w:numPr>
+          <w:ilvl w:val="0"/>
+          <w:numId w:val="31"/>
+        </w:numPr>
+        <w:jc w:val="left"/>
+        <w:rPr>
+          <w:lang w:val="pt-PT"/>
+        </w:rPr>
+      </w:pPr>
+      <w:r>
+        <w:rPr>
+          <w:lang w:val="pt-PT"/>
+        </w:rPr>
+        <w:t>A inteligência artificial (jogador computador) é baseada em jogadas totalmente aleatórias, o que pode resultar em decisões pouco estratégicas e facilmente previsíveis.</w:t>
+      </w:r>
+    </w:p>
+    <w:p>
+      <w:pPr>
+        <w:pStyle w:val="Corpodetexto"/>
+        <w:numPr>
+          <w:ilvl w:val="0"/>
+          <w:numId w:val="31"/>
+        </w:numPr>
+        <w:jc w:val="left"/>
+        <w:rPr>
+          <w:lang w:val="pt-PT"/>
+        </w:rPr>
+      </w:pPr>
+      <w:r>
+        <w:rPr>
+          <w:lang w:val="pt-PT"/>
+        </w:rPr>
+        <w:t>A interface foi otimizada para resoluções comuns de ecrã, podendo não se ajustar corretamente em dispositivos móveis ou ecrãs de tamanhos muito reduzidos.</w:t>
+      </w:r>
+    </w:p>
+    <w:p>
+      <w:pPr>
+        <w:pStyle w:val="Corpodetexto"/>
+        <w:rPr>
+          <w:lang w:val="pt-PT"/>
+        </w:rPr>
+      </w:pPr>
+    </w:p>
+    <w:p>
+      <w:pPr>
+        <w:pStyle w:val="Corpodetexto"/>
+        <w:rPr>
+          <w:lang w:val="pt-PT"/>
+        </w:rPr>
+      </w:pPr>
+    </w:p>
+    <w:p>
+      <w:pPr>
+        <w:pStyle w:val="Ttulo2"/>
+        <w:numPr>
+          <w:ilvl w:val="0"/>
+          <w:numId w:val="23"/>
+        </w:numPr>
+      </w:pPr>
+      <w:proofErr w:type="spellStart"/>
+      <w:r>
+        <w:t>Desafios</w:t>
+      </w:r>
+      <w:proofErr w:type="spellEnd"/>
+    </w:p>
+    <w:p>
+      <w:pPr>
+        <w:pStyle w:val="Corpodetexto"/>
+        <w:rPr>
+          <w:lang w:val="pt-PT"/>
+        </w:rPr>
+      </w:pPr>
+      <w:r>
+        <w:rPr>
+          <w:lang w:val="pt-PT"/>
+        </w:rPr>
+        <w:t>O desenvolvimento do projeto implicou a superação de vários desafios técnicos e de design, entre os quais se destacam:</w:t>
+      </w:r>
+    </w:p>
+    <w:p>
+      <w:pPr>
+        <w:pStyle w:val="Corpodetexto"/>
+        <w:numPr>
+          <w:ilvl w:val="0"/>
+          <w:numId w:val="29"/>
+        </w:numPr>
+        <w:rPr>
+          <w:lang w:val="pt-PT"/>
+        </w:rPr>
+      </w:pPr>
+      <w:r>
+        <w:rPr>
+          <w:b/>
+          <w:bCs/>
+          <w:lang w:val="pt-PT"/>
+        </w:rPr>
+        <w:t>Gestão do estado da aplicação</w:t>
+      </w:r>
+      <w:r>
+        <w:rPr>
+          <w:lang w:val="pt-PT"/>
+        </w:rPr>
+        <w:t xml:space="preserve">: A coordenação entre os vários componentes </w:t>
+      </w:r>
+      <w:proofErr w:type="spellStart"/>
+      <w:r>
+        <w:rPr>
+          <w:lang w:val="pt-PT"/>
+        </w:rPr>
+        <w:t>React</w:t>
+      </w:r>
+      <w:proofErr w:type="spellEnd"/>
+      <w:r>
+        <w:rPr>
+          <w:lang w:val="pt-PT"/>
+        </w:rPr>
+        <w:t xml:space="preserve"> para manter o estado do jogo (jogador atual, tabuleiro, tempo restante, jogadas especiais) exigiu uma organização cuidadosa e uso eficaz dos </w:t>
+      </w:r>
+      <w:proofErr w:type="spellStart"/>
+      <w:r>
+        <w:rPr>
+          <w:lang w:val="pt-PT"/>
+        </w:rPr>
+        <w:t>hooks</w:t>
+      </w:r>
+      <w:proofErr w:type="spellEnd"/>
+      <w:r>
+        <w:rPr>
+          <w:lang w:val="pt-PT"/>
+        </w:rPr>
+        <w:t xml:space="preserve"> (</w:t>
+      </w:r>
+      <w:proofErr w:type="spellStart"/>
+      <w:r>
+        <w:rPr>
+          <w:lang w:val="pt-PT"/>
+        </w:rPr>
+        <w:t>useState</w:t>
+      </w:r>
+      <w:proofErr w:type="spellEnd"/>
+      <w:r>
+        <w:rPr>
+          <w:lang w:val="pt-PT"/>
+        </w:rPr>
+        <w:t xml:space="preserve">, </w:t>
+      </w:r>
+      <w:proofErr w:type="spellStart"/>
+      <w:r>
+        <w:rPr>
+          <w:lang w:val="pt-PT"/>
+        </w:rPr>
+        <w:t>useEffect</w:t>
+      </w:r>
+      <w:proofErr w:type="spellEnd"/>
+      <w:r>
+        <w:rPr>
+          <w:lang w:val="pt-PT"/>
+        </w:rPr>
+        <w:t>).</w:t>
+      </w:r>
+    </w:p>
+    <w:p>
+      <w:pPr>
+        <w:pStyle w:val="Corpodetexto"/>
+        <w:numPr>
+          <w:ilvl w:val="0"/>
+          <w:numId w:val="29"/>
+        </w:numPr>
+        <w:rPr>
+          <w:lang w:val="pt-PT"/>
+        </w:rPr>
+      </w:pPr>
+      <w:r>
+        <w:rPr>
+          <w:b/>
+          <w:bCs/>
+          <w:lang w:val="pt-PT"/>
+        </w:rPr>
+        <w:t>Animação da peça ao descer</w:t>
+      </w:r>
+      <w:r>
+        <w:rPr>
+          <w:lang w:val="pt-PT"/>
+        </w:rPr>
+        <w:t xml:space="preserve">: Implementar a funcionalidade em que a peça "desliza" até à célula correta (opção 3) implicou estudar e integrar técnicas de animação com </w:t>
+      </w:r>
+      <w:proofErr w:type="spellStart"/>
+      <w:r>
+        <w:rPr>
+          <w:lang w:val="pt-PT"/>
+        </w:rPr>
+        <w:t>React</w:t>
+      </w:r>
+      <w:proofErr w:type="spellEnd"/>
+      <w:r>
+        <w:rPr>
+          <w:lang w:val="pt-PT"/>
+        </w:rPr>
+        <w:t xml:space="preserve"> e CSS de forma sincronizada com o estado do jogo.</w:t>
+      </w:r>
+    </w:p>
+    <w:p>
+      <w:pPr>
+        <w:pStyle w:val="Corpodetexto"/>
+        <w:numPr>
+          <w:ilvl w:val="0"/>
+          <w:numId w:val="29"/>
+        </w:numPr>
+        <w:rPr>
+          <w:lang w:val="pt-PT"/>
+        </w:rPr>
+      </w:pPr>
+      <w:r>
+        <w:rPr>
+          <w:b/>
+          <w:bCs/>
+          <w:lang w:val="pt-PT"/>
+        </w:rPr>
+        <w:t>Temporizador de jogada</w:t>
+      </w:r>
+      <w:r>
+        <w:rPr>
+          <w:lang w:val="pt-PT"/>
+        </w:rPr>
+        <w:t>: Garantir que o temporizador reinicia corretamente a cada jogada e respeita o limite de 10 segundos sem interferir com a fluidez do jogo foi um dos pontos mais críticos.</w:t>
+      </w:r>
+    </w:p>
+    <w:p>
+      <w:pPr>
+        <w:pStyle w:val="Corpodetexto"/>
+        <w:numPr>
+          <w:ilvl w:val="0"/>
+          <w:numId w:val="29"/>
+        </w:numPr>
+        <w:rPr>
+          <w:lang w:val="pt-PT"/>
+        </w:rPr>
+      </w:pPr>
+      <w:r>
+        <w:rPr>
+          <w:b/>
+          <w:bCs/>
+          <w:lang w:val="pt-PT"/>
+        </w:rPr>
+        <w:lastRenderedPageBreak/>
+        <w:t>Geração e controlo de células especiais</w:t>
+      </w:r>
+      <w:r>
+        <w:rPr>
+          <w:lang w:val="pt-PT"/>
+        </w:rPr>
+        <w:t>: A definição aleatória e destaque visual das células com bónus exigiu lógica adicional para evitar sobreposições e garantir consistência em cada nova partida.</w:t>
+      </w:r>
+    </w:p>
+    <w:p>
+      <w:pPr>
+        <w:pStyle w:val="Corpodetexto"/>
+        <w:numPr>
+          <w:ilvl w:val="0"/>
+          <w:numId w:val="29"/>
+        </w:numPr>
+        <w:rPr>
+          <w:lang w:val="pt-PT"/>
+        </w:rPr>
+      </w:pPr>
+      <w:r>
+        <w:rPr>
+          <w:b/>
+          <w:bCs/>
+          <w:lang w:val="pt-PT"/>
+        </w:rPr>
+        <w:t>Validação das jogadas</w:t>
+      </w:r>
+      <w:r>
+        <w:rPr>
+          <w:lang w:val="pt-PT"/>
+        </w:rPr>
+        <w:t>: Assegurar que as peças só podem ser colocadas em células válidas, bem como a verificação de condições de vitória em todas as direções (horizontal, vertical, diagonal), representou um desafio lógico importante.</w:t>
+      </w:r>
+    </w:p>
+    <w:p>
+      <w:pPr>
+        <w:pStyle w:val="Corpodetexto"/>
+        <w:rPr>
+          <w:lang w:val="pt-PT"/>
+        </w:rPr>
+      </w:pPr>
+    </w:p>
+    <w:p>
+      <w:pPr>
+        <w:pStyle w:val="Ttulo2"/>
+        <w:numPr>
+          <w:ilvl w:val="0"/>
+          <w:numId w:val="23"/>
+        </w:numPr>
+        <w:rPr>
+          <w:lang w:val="pt-PT"/>
+        </w:rPr>
+      </w:pPr>
+      <w:r>
+        <w:rPr>
+          <w:lang w:val="pt-PT"/>
+        </w:rPr>
+        <w:t>Diagrama de componentes</w:t>
+      </w:r>
+    </w:p>
+    <w:p>
+      <w:pPr>
+        <w:pStyle w:val="Corpodetexto"/>
+        <w:ind w:left="720"/>
+        <w:rPr>
+          <w:sz w:val="18"/>
+          <w:szCs w:val="16"/>
+          <w:lang w:val="pt-PT"/>
+        </w:rPr>
+      </w:pPr>
       <w:r>
         <w:rPr>
           <w:noProof/>
         </w:rPr>
-        <w:lastRenderedPageBreak/>
         <w:drawing>
-          <wp:anchor distT="0" distB="0" distL="114300" distR="114300" simplePos="0" relativeHeight="251664384" behindDoc="0" locked="0" layoutInCell="1" allowOverlap="1" wp14:anchorId="0AA7C210" wp14:editId="66FD5DE3">
+          <wp:anchor distT="0" distB="0" distL="114300" distR="114300" simplePos="0" relativeHeight="251664384" behindDoc="0" locked="0" layoutInCell="1" allowOverlap="1" wp14:anchorId="0AA7C210" wp14:editId="4416EA9F">
             <wp:simplePos x="0" y="0"/>
             <wp:positionH relativeFrom="column">
-              <wp:posOffset>153798</wp:posOffset>
+              <wp:posOffset>-552450</wp:posOffset>
             </wp:positionH>
             <wp:positionV relativeFrom="paragraph">
-              <wp:posOffset>737235</wp:posOffset>
+              <wp:posOffset>177800</wp:posOffset>
             </wp:positionV>
-            <wp:extent cx="5731510" cy="1953895"/>
-            <wp:effectExtent l="0" t="0" r="2540" b="8255"/>
+            <wp:extent cx="6997065" cy="2514600"/>
+            <wp:effectExtent l="0" t="0" r="0" b="0"/>
             <wp:wrapTopAndBottom/>
             <wp:docPr id="1775700191" name="Imagem 4" descr="Uma imagem com texto, captura de ecrã, diagrama, file&#10;&#10;Os conteúdos gerados por IA poderão estar incorretos."/>
             <wp:cNvGraphicFramePr>
@@ -1165,7 +1994,7 @@
                     </pic:cNvPicPr>
                   </pic:nvPicPr>
                   <pic:blipFill>
-                    <a:blip r:embed="rId13">
+                    <a:blip r:embed="rId17">
                       <a:extLst>
                         <a:ext uri="{28A0092B-C50C-407E-A947-70E740481C1C}">
                           <a14:useLocalDpi xmlns:a14="http://schemas.microsoft.com/office/drawing/2010/main" val="0"/>
@@ -1180,7 +2009,7 @@
                   <pic:spPr bwMode="auto">
                     <a:xfrm>
                       <a:off x="0" y="0"/>
-                      <a:ext cx="5731510" cy="1953895"/>
+                      <a:ext cx="6997065" cy="2514600"/>
                     </a:xfrm>
                     <a:prstGeom prst="rect">
                       <a:avLst/>
@@ -1193,26 +2022,15 @@
                 </pic:pic>
               </a:graphicData>
             </a:graphic>
+            <wp14:sizeRelH relativeFrom="margin">
+              <wp14:pctWidth>0</wp14:pctWidth>
+            </wp14:sizeRelH>
+            <wp14:sizeRelV relativeFrom="margin">
+              <wp14:pctHeight>0</wp14:pctHeight>
+            </wp14:sizeRelV>
           </wp:anchor>
         </w:drawing>
       </w:r>
-      <w:r>
-        <w:rPr>
-          <w:lang w:val="pt-PT"/>
-        </w:rPr>
-        <w:t>Diagrama de componentes</w:t>
-      </w:r>
-    </w:p>
-    <w:p>
-      <w:pPr>
-        <w:pStyle w:val="Corpodetexto"/>
-        <w:ind w:left="720"/>
-        <w:rPr>
-          <w:sz w:val="18"/>
-          <w:szCs w:val="16"/>
-          <w:lang w:val="pt-PT"/>
-        </w:rPr>
-      </w:pPr>
     </w:p>
     <w:p>
       <w:pPr>
@@ -1246,8 +2064,6 @@
           <w:numId w:val="26"/>
         </w:numPr>
         <w:rPr>
-          <w:sz w:val="24"/>
-          <w:szCs w:val="22"/>
           <w:lang w:val="pt-PT"/>
         </w:rPr>
       </w:pPr>
@@ -1255,16 +2071,12 @@
         <w:rPr>
           <w:b/>
           <w:bCs/>
-          <w:sz w:val="24"/>
-          <w:szCs w:val="22"/>
           <w:lang w:val="pt-PT"/>
         </w:rPr>
         <w:t>App</w:t>
       </w:r>
       <w:r>
         <w:rPr>
-          <w:sz w:val="24"/>
-          <w:szCs w:val="22"/>
           <w:lang w:val="pt-PT"/>
         </w:rPr>
         <w:t>: Componente principal, define rotas e layout.</w:t>
@@ -1278,8 +2090,6 @@
           <w:numId w:val="26"/>
         </w:numPr>
         <w:rPr>
-          <w:sz w:val="24"/>
-          <w:szCs w:val="22"/>
           <w:lang w:val="pt-PT"/>
         </w:rPr>
       </w:pPr>
@@ -1287,16 +2097,12 @@
         <w:rPr>
           <w:b/>
           <w:bCs/>
-          <w:sz w:val="24"/>
-          <w:szCs w:val="22"/>
           <w:lang w:val="pt-PT"/>
         </w:rPr>
         <w:t>Layout</w:t>
       </w:r>
       <w:r>
         <w:rPr>
-          <w:sz w:val="24"/>
-          <w:szCs w:val="22"/>
           <w:lang w:val="pt-PT"/>
         </w:rPr>
         <w:t>: Estrutura comum (</w:t>
@@ -1304,8 +2110,6 @@
       <w:proofErr w:type="spellStart"/>
       <w:r>
         <w:rPr>
-          <w:sz w:val="24"/>
-          <w:szCs w:val="22"/>
           <w:lang w:val="pt-PT"/>
         </w:rPr>
         <w:t>Header</w:t>
@@ -1313,8 +2117,6 @@
       <w:proofErr w:type="spellEnd"/>
       <w:r>
         <w:rPr>
-          <w:sz w:val="24"/>
-          <w:szCs w:val="22"/>
           <w:lang w:val="pt-PT"/>
         </w:rPr>
         <w:t xml:space="preserve">, </w:t>
@@ -1322,8 +2124,6 @@
       <w:proofErr w:type="spellStart"/>
       <w:r>
         <w:rPr>
-          <w:sz w:val="24"/>
-          <w:szCs w:val="22"/>
           <w:lang w:val="pt-PT"/>
         </w:rPr>
         <w:t>Footer</w:t>
@@ -1331,8 +2131,6 @@
       <w:proofErr w:type="spellEnd"/>
       <w:r>
         <w:rPr>
-          <w:sz w:val="24"/>
-          <w:szCs w:val="22"/>
           <w:lang w:val="pt-PT"/>
         </w:rPr>
         <w:t>, conteúdo).</w:t>
@@ -1346,8 +2144,6 @@
           <w:numId w:val="26"/>
         </w:numPr>
         <w:rPr>
-          <w:sz w:val="24"/>
-          <w:szCs w:val="22"/>
           <w:lang w:val="pt-PT"/>
         </w:rPr>
       </w:pPr>
@@ -1356,8 +2152,6 @@
         <w:rPr>
           <w:b/>
           <w:bCs/>
-          <w:sz w:val="24"/>
-          <w:szCs w:val="22"/>
           <w:lang w:val="pt-PT"/>
         </w:rPr>
         <w:t>Header</w:t>
@@ -1365,8 +2159,6 @@
       <w:proofErr w:type="spellEnd"/>
       <w:r>
         <w:rPr>
-          <w:sz w:val="24"/>
-          <w:szCs w:val="22"/>
           <w:lang w:val="pt-PT"/>
         </w:rPr>
         <w:t>: Navegação, histórico de partidas, top 10 jogadores.</w:t>
@@ -1380,8 +2172,6 @@
           <w:numId w:val="26"/>
         </w:numPr>
         <w:rPr>
-          <w:sz w:val="24"/>
-          <w:szCs w:val="22"/>
           <w:lang w:val="pt-PT"/>
         </w:rPr>
       </w:pPr>
@@ -1390,8 +2180,6 @@
         <w:rPr>
           <w:b/>
           <w:bCs/>
-          <w:sz w:val="24"/>
-          <w:szCs w:val="22"/>
           <w:lang w:val="pt-PT"/>
         </w:rPr>
         <w:t>Footer</w:t>
@@ -1399,8 +2187,6 @@
       <w:proofErr w:type="spellEnd"/>
       <w:r>
         <w:rPr>
-          <w:sz w:val="24"/>
-          <w:szCs w:val="22"/>
           <w:lang w:val="pt-PT"/>
         </w:rPr>
         <w:t>: Créditos e links.</w:t>
@@ -1414,8 +2200,6 @@
           <w:numId w:val="26"/>
         </w:numPr>
         <w:rPr>
-          <w:sz w:val="24"/>
-          <w:szCs w:val="22"/>
           <w:lang w:val="pt-PT"/>
         </w:rPr>
       </w:pPr>
@@ -1424,8 +2208,6 @@
         <w:rPr>
           <w:b/>
           <w:bCs/>
-          <w:sz w:val="24"/>
-          <w:szCs w:val="22"/>
           <w:lang w:val="pt-PT"/>
         </w:rPr>
         <w:t>Welcome</w:t>
@@ -1433,8 +2215,6 @@
       <w:proofErr w:type="spellEnd"/>
       <w:r>
         <w:rPr>
-          <w:sz w:val="24"/>
-          <w:szCs w:val="22"/>
           <w:lang w:val="pt-PT"/>
         </w:rPr>
         <w:t>: Tela inicial, instruções e botão para iniciar o jogo.</w:t>
@@ -1448,8 +2228,6 @@
           <w:numId w:val="26"/>
         </w:numPr>
         <w:rPr>
-          <w:sz w:val="24"/>
-          <w:szCs w:val="22"/>
           <w:lang w:val="pt-PT"/>
         </w:rPr>
       </w:pPr>
@@ -1458,8 +2236,6 @@
         <w:rPr>
           <w:b/>
           <w:bCs/>
-          <w:sz w:val="24"/>
-          <w:szCs w:val="22"/>
           <w:lang w:val="pt-PT"/>
         </w:rPr>
         <w:t>GameMenu</w:t>
@@ -1467,8 +2243,6 @@
       <w:proofErr w:type="spellEnd"/>
       <w:r>
         <w:rPr>
-          <w:sz w:val="24"/>
-          <w:szCs w:val="22"/>
           <w:lang w:val="pt-PT"/>
         </w:rPr>
         <w:t>: Seleção de modo de jogo e configuração dos jogadores.</w:t>
@@ -1482,8 +2256,6 @@
           <w:numId w:val="26"/>
         </w:numPr>
         <w:rPr>
-          <w:sz w:val="24"/>
-          <w:szCs w:val="22"/>
           <w:lang w:val="pt-PT"/>
         </w:rPr>
       </w:pPr>
@@ -1492,8 +2264,6 @@
         <w:rPr>
           <w:b/>
           <w:bCs/>
-          <w:sz w:val="24"/>
-          <w:szCs w:val="22"/>
           <w:lang w:val="pt-PT"/>
         </w:rPr>
         <w:t>GameModeSelector</w:t>
@@ -1501,8 +2271,6 @@
       <w:proofErr w:type="spellEnd"/>
       <w:r>
         <w:rPr>
-          <w:sz w:val="24"/>
-          <w:szCs w:val="22"/>
           <w:lang w:val="pt-PT"/>
         </w:rPr>
         <w:t>/</w:t>
@@ -1512,8 +2280,6 @@
         <w:rPr>
           <w:b/>
           <w:bCs/>
-          <w:sz w:val="24"/>
-          <w:szCs w:val="22"/>
           <w:lang w:val="pt-PT"/>
         </w:rPr>
         <w:t>PieceSelector</w:t>
@@ -1521,11 +2287,29 @@
       <w:proofErr w:type="spellEnd"/>
       <w:r>
         <w:rPr>
-          <w:sz w:val="24"/>
-          <w:szCs w:val="22"/>
-          <w:lang w:val="pt-PT"/>
-        </w:rPr>
-        <w:t>: Escolha de modo (1vs1/PC) e peças.</w:t>
+          <w:lang w:val="pt-PT"/>
+        </w:rPr>
+        <w:t xml:space="preserve">: Escolha de modo (1vs1/PC) e </w:t>
+      </w:r>
+      <w:r>
+        <w:rPr>
+          <w:lang w:val="pt-PT"/>
+        </w:rPr>
+        <w:t xml:space="preserve">nome dos </w:t>
+      </w:r>
+      <w:proofErr w:type="spellStart"/>
+      <w:r>
+        <w:rPr>
+          <w:lang w:val="pt-PT"/>
+        </w:rPr>
+        <w:t>players</w:t>
+      </w:r>
+      <w:proofErr w:type="spellEnd"/>
+      <w:r>
+        <w:rPr>
+          <w:lang w:val="pt-PT"/>
+        </w:rPr>
+        <w:t>.</w:t>
       </w:r>
     </w:p>
     <w:p>
@@ -1536,8 +2320,6 @@
           <w:numId w:val="26"/>
         </w:numPr>
         <w:rPr>
-          <w:sz w:val="24"/>
-          <w:szCs w:val="22"/>
           <w:lang w:val="pt-PT"/>
         </w:rPr>
       </w:pPr>
@@ -1546,8 +2328,6 @@
         <w:rPr>
           <w:b/>
           <w:bCs/>
-          <w:sz w:val="24"/>
-          <w:szCs w:val="22"/>
           <w:lang w:val="pt-PT"/>
         </w:rPr>
         <w:t>Board</w:t>
@@ -1555,8 +2335,6 @@
       <w:proofErr w:type="spellEnd"/>
       <w:r>
         <w:rPr>
-          <w:sz w:val="24"/>
-          <w:szCs w:val="22"/>
           <w:lang w:val="pt-PT"/>
         </w:rPr>
         <w:t>: Lógica e visualização do tabuleiro do jogo.</w:t>
@@ -1570,8 +2348,6 @@
           <w:numId w:val="26"/>
         </w:numPr>
         <w:rPr>
-          <w:sz w:val="24"/>
-          <w:szCs w:val="22"/>
           <w:lang w:val="pt-PT"/>
         </w:rPr>
       </w:pPr>
@@ -1580,8 +2356,6 @@
         <w:rPr>
           <w:b/>
           <w:bCs/>
-          <w:sz w:val="24"/>
-          <w:szCs w:val="22"/>
           <w:lang w:val="pt-PT"/>
         </w:rPr>
         <w:t>BoardHeader</w:t>
@@ -1589,8 +2363,6 @@
       <w:proofErr w:type="spellEnd"/>
       <w:r>
         <w:rPr>
-          <w:sz w:val="24"/>
-          <w:szCs w:val="22"/>
           <w:lang w:val="pt-PT"/>
         </w:rPr>
         <w:t>: Placar, jogador atual, timer.</w:t>
@@ -1604,8 +2376,6 @@
           <w:numId w:val="26"/>
         </w:numPr>
         <w:rPr>
-          <w:sz w:val="24"/>
-          <w:szCs w:val="22"/>
           <w:lang w:val="pt-PT"/>
         </w:rPr>
       </w:pPr>
@@ -1614,17 +2384,14 @@
         <w:rPr>
           <w:b/>
           <w:bCs/>
-          <w:sz w:val="24"/>
-          <w:szCs w:val="22"/>
-          <w:lang w:val="pt-PT"/>
-        </w:rPr>
+          <w:lang w:val="pt-PT"/>
+        </w:rPr>
+        <w:lastRenderedPageBreak/>
         <w:t>GameCell</w:t>
       </w:r>
       <w:proofErr w:type="spellEnd"/>
       <w:r>
         <w:rPr>
-          <w:sz w:val="24"/>
-          <w:szCs w:val="22"/>
           <w:lang w:val="pt-PT"/>
         </w:rPr>
         <w:t>: Cada célula do tabuleiro.</w:t>
@@ -1638,8 +2405,6 @@
           <w:numId w:val="26"/>
         </w:numPr>
         <w:rPr>
-          <w:sz w:val="24"/>
-          <w:szCs w:val="22"/>
           <w:lang w:val="pt-PT"/>
         </w:rPr>
       </w:pPr>
@@ -1648,8 +2413,6 @@
         <w:rPr>
           <w:b/>
           <w:bCs/>
-          <w:sz w:val="24"/>
-          <w:szCs w:val="22"/>
           <w:lang w:val="pt-PT"/>
         </w:rPr>
         <w:t>FloatingPiece</w:t>
@@ -1657,8 +2420,6 @@
       <w:proofErr w:type="spellEnd"/>
       <w:r>
         <w:rPr>
-          <w:sz w:val="24"/>
-          <w:szCs w:val="22"/>
           <w:lang w:val="pt-PT"/>
         </w:rPr>
         <w:t>: Peça que acompanha o mouse.</w:t>
@@ -1672,8 +2433,6 @@
           <w:numId w:val="26"/>
         </w:numPr>
         <w:rPr>
-          <w:sz w:val="24"/>
-          <w:szCs w:val="22"/>
           <w:lang w:val="pt-PT"/>
         </w:rPr>
       </w:pPr>
@@ -1681,16 +2440,12 @@
         <w:rPr>
           <w:b/>
           <w:bCs/>
-          <w:sz w:val="24"/>
-          <w:szCs w:val="22"/>
           <w:lang w:val="pt-PT"/>
         </w:rPr>
         <w:t>Pop-Ups</w:t>
       </w:r>
       <w:r>
         <w:rPr>
-          <w:sz w:val="24"/>
-          <w:szCs w:val="22"/>
           <w:lang w:val="pt-PT"/>
         </w:rPr>
         <w:t>: Mensagens, histórico e top 10.</w:t>
@@ -1699,6 +2454,7 @@
     <w:p>
       <w:pPr>
         <w:pStyle w:val="Corpodetexto"/>
+        <w:ind w:left="1440"/>
         <w:rPr>
           <w:lang w:val="pt-PT"/>
         </w:rPr>
@@ -1751,8 +2507,7 @@
           <w:numId w:val="27"/>
         </w:numPr>
         <w:rPr>
-          <w:sz w:val="24"/>
-          <w:szCs w:val="22"/>
+          <w:szCs w:val="28"/>
           <w:lang w:val="pt-PT"/>
         </w:rPr>
       </w:pPr>
@@ -1761,8 +2516,7 @@
         <w:rPr>
           <w:b/>
           <w:bCs/>
-          <w:sz w:val="24"/>
-          <w:szCs w:val="22"/>
+          <w:szCs w:val="28"/>
           <w:lang w:val="pt-PT"/>
         </w:rPr>
         <w:t>React</w:t>
@@ -1770,8 +2524,7 @@
       <w:proofErr w:type="spellEnd"/>
       <w:r>
         <w:rPr>
-          <w:sz w:val="24"/>
-          <w:szCs w:val="22"/>
+          <w:szCs w:val="28"/>
           <w:lang w:val="pt-PT"/>
         </w:rPr>
         <w:t xml:space="preserve"> para </w:t>
@@ -1779,8 +2532,7 @@
       <w:proofErr w:type="spellStart"/>
       <w:r>
         <w:rPr>
-          <w:sz w:val="24"/>
-          <w:szCs w:val="22"/>
+          <w:szCs w:val="28"/>
           <w:lang w:val="pt-PT"/>
         </w:rPr>
         <w:t>componentização</w:t>
@@ -1788,8 +2540,7 @@
       <w:proofErr w:type="spellEnd"/>
       <w:r>
         <w:rPr>
-          <w:sz w:val="24"/>
-          <w:szCs w:val="22"/>
+          <w:szCs w:val="28"/>
           <w:lang w:val="pt-PT"/>
         </w:rPr>
         <w:t xml:space="preserve"> e gerenciamento de estado.</w:t>
@@ -1803,8 +2554,7 @@
           <w:numId w:val="27"/>
         </w:numPr>
         <w:rPr>
-          <w:sz w:val="24"/>
-          <w:szCs w:val="22"/>
+          <w:szCs w:val="28"/>
           <w:lang w:val="pt-PT"/>
         </w:rPr>
       </w:pPr>
@@ -1813,8 +2563,7 @@
         <w:rPr>
           <w:b/>
           <w:bCs/>
-          <w:sz w:val="24"/>
-          <w:szCs w:val="22"/>
+          <w:szCs w:val="28"/>
           <w:lang w:val="pt-PT"/>
         </w:rPr>
         <w:t>React</w:t>
@@ -1824,16 +2573,14 @@
         <w:rPr>
           <w:b/>
           <w:bCs/>
-          <w:sz w:val="24"/>
-          <w:szCs w:val="22"/>
+          <w:szCs w:val="28"/>
           <w:lang w:val="pt-PT"/>
         </w:rPr>
         <w:t xml:space="preserve"> Router</w:t>
       </w:r>
       <w:r>
         <w:rPr>
-          <w:sz w:val="24"/>
-          <w:szCs w:val="22"/>
+          <w:szCs w:val="28"/>
           <w:lang w:val="pt-PT"/>
         </w:rPr>
         <w:t> para navegação entre páginas.</w:t>
@@ -1847,8 +2594,7 @@
           <w:numId w:val="27"/>
         </w:numPr>
         <w:rPr>
-          <w:sz w:val="24"/>
-          <w:szCs w:val="22"/>
+          <w:szCs w:val="28"/>
           <w:lang w:val="pt-PT"/>
         </w:rPr>
       </w:pPr>
@@ -1856,8 +2602,7 @@
         <w:rPr>
           <w:b/>
           <w:bCs/>
-          <w:sz w:val="24"/>
-          <w:szCs w:val="22"/>
+          <w:szCs w:val="28"/>
           <w:lang w:val="pt-PT"/>
         </w:rPr>
         <w:t xml:space="preserve">CSS Modules e media </w:t>
@@ -1867,8 +2612,7 @@
         <w:rPr>
           <w:b/>
           <w:bCs/>
-          <w:sz w:val="24"/>
-          <w:szCs w:val="22"/>
+          <w:szCs w:val="28"/>
           <w:lang w:val="pt-PT"/>
         </w:rPr>
         <w:t>queries</w:t>
@@ -1876,17 +2620,15 @@
       <w:proofErr w:type="spellEnd"/>
       <w:r>
         <w:rPr>
-          <w:sz w:val="24"/>
-          <w:szCs w:val="22"/>
+          <w:szCs w:val="28"/>
           <w:lang w:val="pt-PT"/>
         </w:rPr>
         <w:t xml:space="preserve"> para responsividade (exemplo: </w:t>
       </w:r>
-      <w:hyperlink r:id="rId14" w:history="1">
+      <w:hyperlink r:id="rId18" w:history="1">
         <w:r>
           <w:rPr>
-            <w:sz w:val="24"/>
-            <w:szCs w:val="22"/>
+            <w:szCs w:val="28"/>
             <w:lang w:val="pt-PT"/>
           </w:rPr>
           <w:t>Responsive.css</w:t>
@@ -1894,8 +2636,7 @@
       </w:hyperlink>
       <w:r>
         <w:rPr>
-          <w:sz w:val="24"/>
-          <w:szCs w:val="22"/>
+          <w:szCs w:val="28"/>
           <w:lang w:val="pt-PT"/>
         </w:rPr>
         <w:t>).</w:t>
@@ -1909,8 +2650,7 @@
           <w:numId w:val="27"/>
         </w:numPr>
         <w:rPr>
-          <w:sz w:val="24"/>
-          <w:szCs w:val="22"/>
+          <w:szCs w:val="28"/>
           <w:lang w:val="pt-PT"/>
         </w:rPr>
       </w:pPr>
@@ -1919,8 +2659,7 @@
         <w:rPr>
           <w:b/>
           <w:bCs/>
-          <w:sz w:val="24"/>
-          <w:szCs w:val="22"/>
+          <w:szCs w:val="28"/>
           <w:lang w:val="pt-PT"/>
         </w:rPr>
         <w:t>LocalStorage</w:t>
@@ -1928,30 +2667,11 @@
       <w:proofErr w:type="spellEnd"/>
       <w:r>
         <w:rPr>
-          <w:sz w:val="24"/>
-          <w:szCs w:val="22"/>
+          <w:szCs w:val="28"/>
           <w:lang w:val="pt-PT"/>
         </w:rPr>
         <w:t> para persistência de histórico e top 10.</w:t>
       </w:r>
-      <w:r>
-        <w:rPr>
-          <w:szCs w:val="22"/>
-          <w:lang w:val="pt-PT"/>
-        </w:rPr>
-        <w:br w:type="page"/>
-      </w:r>
-    </w:p>
-    <w:p>
-      <w:pPr>
-        <w:pStyle w:val="Corpodetexto"/>
-        <w:ind w:left="1440"/>
-        <w:rPr>
-          <w:sz w:val="24"/>
-          <w:szCs w:val="22"/>
-          <w:lang w:val="pt-PT"/>
-        </w:rPr>
-      </w:pPr>
     </w:p>
     <w:p>
       <w:pPr>
@@ -1961,8 +2681,7 @@
           <w:numId w:val="27"/>
         </w:numPr>
         <w:rPr>
-          <w:sz w:val="24"/>
-          <w:szCs w:val="22"/>
+          <w:szCs w:val="28"/>
           <w:lang w:val="pt-PT"/>
         </w:rPr>
       </w:pPr>
@@ -1971,8 +2690,7 @@
         <w:rPr>
           <w:b/>
           <w:bCs/>
-          <w:sz w:val="24"/>
-          <w:szCs w:val="22"/>
+          <w:szCs w:val="28"/>
           <w:lang w:val="pt-PT"/>
         </w:rPr>
         <w:t>Hooks</w:t>
@@ -1980,8 +2698,7 @@
       <w:proofErr w:type="spellEnd"/>
       <w:r>
         <w:rPr>
-          <w:sz w:val="24"/>
-          <w:szCs w:val="22"/>
+          <w:szCs w:val="28"/>
           <w:lang w:val="pt-PT"/>
         </w:rPr>
         <w:t> (</w:t>
@@ -1989,8 +2706,7 @@
       <w:proofErr w:type="spellStart"/>
       <w:r>
         <w:rPr>
-          <w:sz w:val="24"/>
-          <w:szCs w:val="22"/>
+          <w:szCs w:val="28"/>
           <w:lang w:val="pt-PT"/>
         </w:rPr>
         <w:t>useState</w:t>
@@ -1998,8 +2714,7 @@
       <w:proofErr w:type="spellEnd"/>
       <w:r>
         <w:rPr>
-          <w:sz w:val="24"/>
-          <w:szCs w:val="22"/>
+          <w:szCs w:val="28"/>
           <w:lang w:val="pt-PT"/>
         </w:rPr>
         <w:t>, </w:t>
@@ -2007,8 +2722,7 @@
       <w:proofErr w:type="spellStart"/>
       <w:r>
         <w:rPr>
-          <w:sz w:val="24"/>
-          <w:szCs w:val="22"/>
+          <w:szCs w:val="28"/>
           <w:lang w:val="pt-PT"/>
         </w:rPr>
         <w:t>useEffect</w:t>
@@ -2016,8 +2730,7 @@
       <w:proofErr w:type="spellEnd"/>
       <w:r>
         <w:rPr>
-          <w:sz w:val="24"/>
-          <w:szCs w:val="22"/>
+          <w:szCs w:val="28"/>
           <w:lang w:val="pt-PT"/>
         </w:rPr>
         <w:t>) para lógica de jogo e UI.</w:t>
@@ -2031,8 +2744,7 @@
           <w:numId w:val="27"/>
         </w:numPr>
         <w:rPr>
-          <w:sz w:val="24"/>
-          <w:szCs w:val="22"/>
+          <w:szCs w:val="28"/>
           <w:lang w:val="pt-PT"/>
         </w:rPr>
       </w:pPr>
@@ -2040,16 +2752,14 @@
         <w:rPr>
           <w:b/>
           <w:bCs/>
-          <w:sz w:val="24"/>
-          <w:szCs w:val="22"/>
+          <w:szCs w:val="28"/>
           <w:lang w:val="pt-PT"/>
         </w:rPr>
         <w:t xml:space="preserve">Pop-ups </w:t>
       </w:r>
       <w:r>
         <w:rPr>
-          <w:sz w:val="24"/>
-          <w:szCs w:val="22"/>
+          <w:szCs w:val="28"/>
           <w:lang w:val="pt-PT"/>
         </w:rPr>
         <w:t>customizados para feedback ao usuário.</w:t>
@@ -2063,8 +2773,7 @@
           <w:numId w:val="27"/>
         </w:numPr>
         <w:rPr>
-          <w:sz w:val="24"/>
-          <w:szCs w:val="22"/>
+          <w:szCs w:val="28"/>
           <w:lang w:val="pt-PT"/>
         </w:rPr>
       </w:pPr>
@@ -2072,16 +2781,14 @@
         <w:rPr>
           <w:b/>
           <w:bCs/>
-          <w:sz w:val="24"/>
-          <w:szCs w:val="22"/>
+          <w:szCs w:val="28"/>
           <w:lang w:val="pt-PT"/>
         </w:rPr>
         <w:t>Design responsivo</w:t>
       </w:r>
       <w:r>
         <w:rPr>
-          <w:sz w:val="24"/>
-          <w:szCs w:val="22"/>
+          <w:szCs w:val="28"/>
           <w:lang w:val="pt-PT"/>
         </w:rPr>
         <w:t> para funcionar bem em dispositivos móveis.</w:t>
@@ -2132,9 +2839,9 @@
           <w:lang w:val="pt-PT"/>
         </w:rPr>
       </w:pPr>
-      <w:bookmarkStart w:id="4" w:name="header-n67"/>
-      <w:bookmarkStart w:id="5" w:name="OLE_LINK73"/>
-      <w:bookmarkStart w:id="6" w:name="OLE_LINK74"/>
+      <w:bookmarkStart w:id="4" w:name="OLE_LINK73"/>
+      <w:bookmarkStart w:id="5" w:name="OLE_LINK74"/>
+      <w:bookmarkStart w:id="6" w:name="header-n67"/>
     </w:p>
     <w:p>
       <w:pPr>
@@ -2144,7 +2851,17 @@
         </w:rPr>
       </w:pPr>
     </w:p>
+    <w:bookmarkEnd w:id="4"/>
     <w:bookmarkEnd w:id="5"/>
+    <w:p>
+      <w:pPr>
+        <w:pStyle w:val="Corpodetexto"/>
+        <w:rPr>
+          <w:lang w:val="pt-PT"/>
+        </w:rPr>
+      </w:pPr>
+    </w:p>
+    <w:bookmarkEnd w:id="3"/>
     <w:bookmarkEnd w:id="6"/>
     <w:p>
       <w:pPr>
@@ -2152,22 +2869,13 @@
         <w:rPr>
           <w:lang w:val="pt-PT"/>
         </w:rPr>
-      </w:pPr>
-    </w:p>
-    <w:bookmarkEnd w:id="3"/>
-    <w:bookmarkEnd w:id="4"/>
-    <w:p>
-      <w:pPr>
-        <w:pStyle w:val="Corpodetexto"/>
-        <w:rPr>
-          <w:lang w:val="pt-PT"/>
-        </w:rPr>
         <w:sectPr>
-          <w:footerReference w:type="default" r:id="rId15"/>
+          <w:footerReference w:type="default" r:id="rId19"/>
           <w:pgSz w:w="11906" w:h="16838"/>
           <w:pgMar w:top="1440" w:right="1440" w:bottom="1440" w:left="1440" w:header="720" w:footer="720" w:gutter="0"/>
           <w:pgNumType w:start="1"/>
           <w:cols w:space="720"/>
+          <w:docGrid w:linePitch="326"/>
         </w:sectPr>
       </w:pPr>
     </w:p>
@@ -2208,7 +2916,7 @@
                     <pic:cNvPicPr/>
                   </pic:nvPicPr>
                   <pic:blipFill>
-                    <a:blip r:embed="rId16" cstate="print">
+                    <a:blip r:embed="rId20" cstate="print">
                       <a:extLst>
                         <a:ext uri="{28A0092B-C50C-407E-A947-70E740481C1C}">
                           <a14:useLocalDpi xmlns:a14="http://schemas.microsoft.com/office/drawing/2010/main" val="0"/>
@@ -2324,8 +3032,8 @@
       <w:bookmarkEnd w:id="1"/>
     </w:p>
     <w:sectPr>
-      <w:headerReference w:type="default" r:id="rId17"/>
-      <w:footerReference w:type="default" r:id="rId18"/>
+      <w:headerReference w:type="default" r:id="rId21"/>
+      <w:footerReference w:type="default" r:id="rId22"/>
       <w:pgSz w:w="11906" w:h="16838"/>
       <w:pgMar w:top="1440" w:right="1440" w:bottom="1440" w:left="1440" w:header="720" w:footer="720" w:gutter="0"/>
       <w:pgNumType w:start="1"/>
@@ -2533,6 +3241,40 @@
         <w:rFonts w:ascii="Arial" w:hAnsi="Arial" w:cs="Arial"/>
         <w:sz w:val="20"/>
         <w:szCs w:val="20"/>
+        <w:lang w:val="pt-PT"/>
+      </w:rPr>
+    </w:pPr>
+    <w:r>
+      <w:rPr>
+        <w:rFonts w:ascii="Arial" w:hAnsi="Arial" w:cs="Arial"/>
+        <w:sz w:val="20"/>
+        <w:szCs w:val="20"/>
+        <w:lang w:val="pt-PT"/>
+      </w:rPr>
+      <w:t>Instituto Superior de Engenharia de Coimbra</w:t>
+    </w:r>
+  </w:p>
+  <w:p>
+    <w:pPr>
+      <w:pStyle w:val="Cabealho"/>
+      <w:rPr>
+        <w:lang w:val="pt-PT"/>
+      </w:rPr>
+    </w:pPr>
+  </w:p>
+</w:hdr>
+</file>
+
+<file path=word/header2.xml><?xml version="1.0" encoding="utf-8"?>
+<w:hdr xmlns:wpc="http://schemas.microsoft.com/office/word/2010/wordprocessingCanvas" xmlns:cx="http://schemas.microsoft.com/office/drawing/2014/chartex" xmlns:cx1="http://schemas.microsoft.com/office/drawing/2015/9/8/chartex" xmlns:cx2="http://schemas.microsoft.com/office/drawing/2015/10/21/chartex" xmlns:cx3="http://schemas.microsoft.com/office/drawing/2016/5/9/chartex" xmlns:cx4="http://schemas.microsoft.com/office/drawing/2016/5/10/chartex" xmlns:cx5="http://schemas.microsoft.com/office/drawing/2016/5/11/chartex" xmlns:cx6="http://schemas.microsoft.com/office/drawing/2016/5/12/chartex" xmlns:cx7="http://schemas.microsoft.com/office/drawing/2016/5/13/chartex" xmlns:cx8="http://schemas.microsoft.com/office/drawing/2016/5/14/chartex" xmlns:mc="http://schemas.openxmlformats.org/markup-compatibility/2006" xmlns:aink="http://schemas.microsoft.com/office/drawing/2016/ink" xmlns:am3d="http://schemas.microsoft.com/office/drawing/2017/model3d" xmlns:o="urn:schemas-microsoft-com:office:office" xmlns:oel="http://schemas.microsoft.com/office/2019/extlst" xmlns:r="http://schemas.openxmlformats.org/officeDocument/2006/relationships" xmlns:m="http://schemas.openxmlformats.org/officeDocument/2006/math" xmlns:v="urn:schemas-microsoft-com:vml" xmlns:wp14="http://schemas.microsoft.com/office/word/2010/wordprocessingDrawing" xmlns:wp="http://schemas.openxmlformats.org/drawingml/2006/wordprocessingDrawing" xmlns:w10="urn:schemas-microsoft-com:office:word" xmlns:w="http://schemas.openxmlformats.org/wordprocessingml/2006/main" xmlns:w14="http://schemas.microsoft.com/office/word/2010/wordml" xmlns:w15="http://schemas.microsoft.com/office/word/2012/wordml" xmlns:w16cex="http://schemas.microsoft.com/office/word/2018/wordml/cex" xmlns:w16cid="http://schemas.microsoft.com/office/word/2016/wordml/cid" xmlns:w16="http://schemas.microsoft.com/office/word/2018/wordml" xmlns:w16du="http://schemas.microsoft.com/office/word/2023/wordml/word16du" xmlns:w16sdtdh="http://schemas.microsoft.com/office/word/2020/wordml/sdtdatahash" xmlns:w16sdtfl="http://schemas.microsoft.com/office/word/2024/wordml/sdtformatlock" xmlns:w16se="http://schemas.microsoft.com/office/word/2015/wordml/symex" xmlns:wpg="http://schemas.microsoft.com/office/word/2010/wordprocessingGroup" xmlns:wpi="http://schemas.microsoft.com/office/word/2010/wordprocessingInk" xmlns:wne="http://schemas.microsoft.com/office/word/2006/wordml" xmlns:wps="http://schemas.microsoft.com/office/word/2010/wordprocessingShape" mc:Ignorable="w14 w15 w16se w16cid w16 w16cex w16sdtdh w16sdtfl w16du wp14">
+  <w:p>
+    <w:pPr>
+      <w:pStyle w:val="Cabealho"/>
+      <w:jc w:val="right"/>
+      <w:rPr>
+        <w:rFonts w:ascii="Arial" w:hAnsi="Arial" w:cs="Arial"/>
+        <w:sz w:val="20"/>
+        <w:szCs w:val="20"/>
       </w:rPr>
     </w:pPr>
   </w:p>
@@ -2590,7 +3332,7 @@
 </w:hdr>
 </file>
 
-<file path=word/header2.xml><?xml version="1.0" encoding="utf-8"?>
+<file path=word/header3.xml><?xml version="1.0" encoding="utf-8"?>
 <w:hdr xmlns:wpc="http://schemas.microsoft.com/office/word/2010/wordprocessingCanvas" xmlns:cx="http://schemas.microsoft.com/office/drawing/2014/chartex" xmlns:cx1="http://schemas.microsoft.com/office/drawing/2015/9/8/chartex" xmlns:cx2="http://schemas.microsoft.com/office/drawing/2015/10/21/chartex" xmlns:cx3="http://schemas.microsoft.com/office/drawing/2016/5/9/chartex" xmlns:cx4="http://schemas.microsoft.com/office/drawing/2016/5/10/chartex" xmlns:cx5="http://schemas.microsoft.com/office/drawing/2016/5/11/chartex" xmlns:cx6="http://schemas.microsoft.com/office/drawing/2016/5/12/chartex" xmlns:cx7="http://schemas.microsoft.com/office/drawing/2016/5/13/chartex" xmlns:cx8="http://schemas.microsoft.com/office/drawing/2016/5/14/chartex" xmlns:mc="http://schemas.openxmlformats.org/markup-compatibility/2006" xmlns:aink="http://schemas.microsoft.com/office/drawing/2016/ink" xmlns:am3d="http://schemas.microsoft.com/office/drawing/2017/model3d" xmlns:o="urn:schemas-microsoft-com:office:office" xmlns:oel="http://schemas.microsoft.com/office/2019/extlst" xmlns:r="http://schemas.openxmlformats.org/officeDocument/2006/relationships" xmlns:m="http://schemas.openxmlformats.org/officeDocument/2006/math" xmlns:v="urn:schemas-microsoft-com:vml" xmlns:wp14="http://schemas.microsoft.com/office/word/2010/wordprocessingDrawing" xmlns:wp="http://schemas.openxmlformats.org/drawingml/2006/wordprocessingDrawing" xmlns:w10="urn:schemas-microsoft-com:office:word" xmlns:w="http://schemas.openxmlformats.org/wordprocessingml/2006/main" xmlns:w14="http://schemas.microsoft.com/office/word/2010/wordml" xmlns:w15="http://schemas.microsoft.com/office/word/2012/wordml" xmlns:w16cex="http://schemas.microsoft.com/office/word/2018/wordml/cex" xmlns:w16cid="http://schemas.microsoft.com/office/word/2016/wordml/cid" xmlns:w16="http://schemas.microsoft.com/office/word/2018/wordml" xmlns:w16du="http://schemas.microsoft.com/office/word/2023/wordml/word16du" xmlns:w16sdtdh="http://schemas.microsoft.com/office/word/2020/wordml/sdtdatahash" xmlns:w16sdtfl="http://schemas.microsoft.com/office/word/2024/wordml/sdtformatlock" xmlns:w16se="http://schemas.microsoft.com/office/word/2015/wordml/symex" xmlns:wpg="http://schemas.microsoft.com/office/word/2010/wordprocessingGroup" xmlns:wpi="http://schemas.microsoft.com/office/word/2010/wordprocessingInk" xmlns:wne="http://schemas.microsoft.com/office/word/2006/wordml" xmlns:wps="http://schemas.microsoft.com/office/word/2010/wordprocessingShape" mc:Ignorable="w14 w15 w16se w16cid w16 w16cex w16sdtdh w16sdtfl w16du wp14">
   <w:p>
     <w:pPr>
@@ -2991,6 +3733,155 @@
     </w:lvl>
   </w:abstractNum>
   <w:abstractNum w:abstractNumId="3" w15:restartNumberingAfterBreak="0">
+    <w:nsid w:val="0C1F45B3"/>
+    <w:multiLevelType w:val="multilevel"/>
+    <w:tmpl w:val="32961EB8"/>
+    <w:lvl w:ilvl="0">
+      <w:start w:val="1"/>
+      <w:numFmt w:val="bullet"/>
+      <w:lvlText w:val=""/>
+      <w:lvlJc w:val="left"/>
+      <w:pPr>
+        <w:tabs>
+          <w:tab w:val="num" w:pos="1080"/>
+        </w:tabs>
+        <w:ind w:left="1080" w:hanging="360"/>
+      </w:pPr>
+      <w:rPr>
+        <w:rFonts w:ascii="Symbol" w:hAnsi="Symbol" w:hint="default"/>
+        <w:sz w:val="20"/>
+      </w:rPr>
+    </w:lvl>
+    <w:lvl w:ilvl="1" w:tentative="1">
+      <w:start w:val="1"/>
+      <w:numFmt w:val="bullet"/>
+      <w:lvlText w:val="o"/>
+      <w:lvlJc w:val="left"/>
+      <w:pPr>
+        <w:tabs>
+          <w:tab w:val="num" w:pos="1800"/>
+        </w:tabs>
+        <w:ind w:left="1800" w:hanging="360"/>
+      </w:pPr>
+      <w:rPr>
+        <w:rFonts w:ascii="Courier New" w:hAnsi="Courier New" w:hint="default"/>
+        <w:sz w:val="20"/>
+      </w:rPr>
+    </w:lvl>
+    <w:lvl w:ilvl="2" w:tentative="1">
+      <w:start w:val="1"/>
+      <w:numFmt w:val="bullet"/>
+      <w:lvlText w:val=""/>
+      <w:lvlJc w:val="left"/>
+      <w:pPr>
+        <w:tabs>
+          <w:tab w:val="num" w:pos="2520"/>
+        </w:tabs>
+        <w:ind w:left="2520" w:hanging="360"/>
+      </w:pPr>
+      <w:rPr>
+        <w:rFonts w:ascii="Wingdings" w:hAnsi="Wingdings" w:hint="default"/>
+        <w:sz w:val="20"/>
+      </w:rPr>
+    </w:lvl>
+    <w:lvl w:ilvl="3" w:tentative="1">
+      <w:start w:val="1"/>
+      <w:numFmt w:val="bullet"/>
+      <w:lvlText w:val=""/>
+      <w:lvlJc w:val="left"/>
+      <w:pPr>
+        <w:tabs>
+          <w:tab w:val="num" w:pos="3240"/>
+        </w:tabs>
+        <w:ind w:left="3240" w:hanging="360"/>
+      </w:pPr>
+      <w:rPr>
+        <w:rFonts w:ascii="Wingdings" w:hAnsi="Wingdings" w:hint="default"/>
+        <w:sz w:val="20"/>
+      </w:rPr>
+    </w:lvl>
+    <w:lvl w:ilvl="4" w:tentative="1">
+      <w:start w:val="1"/>
+      <w:numFmt w:val="bullet"/>
+      <w:lvlText w:val=""/>
+      <w:lvlJc w:val="left"/>
+      <w:pPr>
+        <w:tabs>
+          <w:tab w:val="num" w:pos="3960"/>
+        </w:tabs>
+        <w:ind w:left="3960" w:hanging="360"/>
+      </w:pPr>
+      <w:rPr>
+        <w:rFonts w:ascii="Wingdings" w:hAnsi="Wingdings" w:hint="default"/>
+        <w:sz w:val="20"/>
+      </w:rPr>
+    </w:lvl>
+    <w:lvl w:ilvl="5" w:tentative="1">
+      <w:start w:val="1"/>
+      <w:numFmt w:val="bullet"/>
+      <w:lvlText w:val=""/>
+      <w:lvlJc w:val="left"/>
+      <w:pPr>
+        <w:tabs>
+          <w:tab w:val="num" w:pos="4680"/>
+        </w:tabs>
+        <w:ind w:left="4680" w:hanging="360"/>
+      </w:pPr>
+      <w:rPr>
+        <w:rFonts w:ascii="Wingdings" w:hAnsi="Wingdings" w:hint="default"/>
+        <w:sz w:val="20"/>
+      </w:rPr>
+    </w:lvl>
+    <w:lvl w:ilvl="6" w:tentative="1">
+      <w:start w:val="1"/>
+      <w:numFmt w:val="bullet"/>
+      <w:lvlText w:val=""/>
+      <w:lvlJc w:val="left"/>
+      <w:pPr>
+        <w:tabs>
+          <w:tab w:val="num" w:pos="5400"/>
+        </w:tabs>
+        <w:ind w:left="5400" w:hanging="360"/>
+      </w:pPr>
+      <w:rPr>
+        <w:rFonts w:ascii="Wingdings" w:hAnsi="Wingdings" w:hint="default"/>
+        <w:sz w:val="20"/>
+      </w:rPr>
+    </w:lvl>
+    <w:lvl w:ilvl="7" w:tentative="1">
+      <w:start w:val="1"/>
+      <w:numFmt w:val="bullet"/>
+      <w:lvlText w:val=""/>
+      <w:lvlJc w:val="left"/>
+      <w:pPr>
+        <w:tabs>
+          <w:tab w:val="num" w:pos="6120"/>
+        </w:tabs>
+        <w:ind w:left="6120" w:hanging="360"/>
+      </w:pPr>
+      <w:rPr>
+        <w:rFonts w:ascii="Wingdings" w:hAnsi="Wingdings" w:hint="default"/>
+        <w:sz w:val="20"/>
+      </w:rPr>
+    </w:lvl>
+    <w:lvl w:ilvl="8" w:tentative="1">
+      <w:start w:val="1"/>
+      <w:numFmt w:val="bullet"/>
+      <w:lvlText w:val=""/>
+      <w:lvlJc w:val="left"/>
+      <w:pPr>
+        <w:tabs>
+          <w:tab w:val="num" w:pos="6840"/>
+        </w:tabs>
+        <w:ind w:left="6840" w:hanging="360"/>
+      </w:pPr>
+      <w:rPr>
+        <w:rFonts w:ascii="Wingdings" w:hAnsi="Wingdings" w:hint="default"/>
+        <w:sz w:val="20"/>
+      </w:rPr>
+    </w:lvl>
+  </w:abstractNum>
+  <w:abstractNum w:abstractNumId="4" w15:restartNumberingAfterBreak="0">
     <w:nsid w:val="0CC17620"/>
     <w:multiLevelType w:val="multilevel"/>
     <w:tmpl w:val="0809001D"/>
@@ -3077,7 +3968,7 @@
       </w:pPr>
     </w:lvl>
   </w:abstractNum>
-  <w:abstractNum w:abstractNumId="4" w15:restartNumberingAfterBreak="0">
+  <w:abstractNum w:abstractNumId="5" w15:restartNumberingAfterBreak="0">
     <w:nsid w:val="1792730A"/>
     <w:multiLevelType w:val="multilevel"/>
     <w:tmpl w:val="1396ACD0"/>
@@ -3226,7 +4117,7 @@
       </w:rPr>
     </w:lvl>
   </w:abstractNum>
-  <w:abstractNum w:abstractNumId="5" w15:restartNumberingAfterBreak="0">
+  <w:abstractNum w:abstractNumId="6" w15:restartNumberingAfterBreak="0">
     <w:nsid w:val="1EA434B3"/>
     <w:multiLevelType w:val="multilevel"/>
     <w:tmpl w:val="CB7031A2"/>
@@ -3375,7 +4266,156 @@
       </w:rPr>
     </w:lvl>
   </w:abstractNum>
-  <w:abstractNum w:abstractNumId="6" w15:restartNumberingAfterBreak="0">
+  <w:abstractNum w:abstractNumId="7" w15:restartNumberingAfterBreak="0">
+    <w:nsid w:val="203E1D9B"/>
+    <w:multiLevelType w:val="multilevel"/>
+    <w:tmpl w:val="99946F7C"/>
+    <w:lvl w:ilvl="0">
+      <w:start w:val="1"/>
+      <w:numFmt w:val="bullet"/>
+      <w:lvlText w:val=""/>
+      <w:lvlJc w:val="left"/>
+      <w:pPr>
+        <w:tabs>
+          <w:tab w:val="num" w:pos="720"/>
+        </w:tabs>
+        <w:ind w:left="720" w:hanging="360"/>
+      </w:pPr>
+      <w:rPr>
+        <w:rFonts w:ascii="Wingdings" w:hAnsi="Wingdings" w:hint="default"/>
+        <w:sz w:val="20"/>
+      </w:rPr>
+    </w:lvl>
+    <w:lvl w:ilvl="1" w:tentative="1">
+      <w:start w:val="1"/>
+      <w:numFmt w:val="bullet"/>
+      <w:lvlText w:val="o"/>
+      <w:lvlJc w:val="left"/>
+      <w:pPr>
+        <w:tabs>
+          <w:tab w:val="num" w:pos="1440"/>
+        </w:tabs>
+        <w:ind w:left="1440" w:hanging="360"/>
+      </w:pPr>
+      <w:rPr>
+        <w:rFonts w:ascii="Courier New" w:hAnsi="Courier New" w:hint="default"/>
+        <w:sz w:val="20"/>
+      </w:rPr>
+    </w:lvl>
+    <w:lvl w:ilvl="2" w:tentative="1">
+      <w:start w:val="1"/>
+      <w:numFmt w:val="bullet"/>
+      <w:lvlText w:val=""/>
+      <w:lvlJc w:val="left"/>
+      <w:pPr>
+        <w:tabs>
+          <w:tab w:val="num" w:pos="2160"/>
+        </w:tabs>
+        <w:ind w:left="2160" w:hanging="360"/>
+      </w:pPr>
+      <w:rPr>
+        <w:rFonts w:ascii="Wingdings" w:hAnsi="Wingdings" w:hint="default"/>
+        <w:sz w:val="20"/>
+      </w:rPr>
+    </w:lvl>
+    <w:lvl w:ilvl="3" w:tentative="1">
+      <w:start w:val="1"/>
+      <w:numFmt w:val="bullet"/>
+      <w:lvlText w:val=""/>
+      <w:lvlJc w:val="left"/>
+      <w:pPr>
+        <w:tabs>
+          <w:tab w:val="num" w:pos="2880"/>
+        </w:tabs>
+        <w:ind w:left="2880" w:hanging="360"/>
+      </w:pPr>
+      <w:rPr>
+        <w:rFonts w:ascii="Wingdings" w:hAnsi="Wingdings" w:hint="default"/>
+        <w:sz w:val="20"/>
+      </w:rPr>
+    </w:lvl>
+    <w:lvl w:ilvl="4" w:tentative="1">
+      <w:start w:val="1"/>
+      <w:numFmt w:val="bullet"/>
+      <w:lvlText w:val=""/>
+      <w:lvlJc w:val="left"/>
+      <w:pPr>
+        <w:tabs>
+          <w:tab w:val="num" w:pos="3600"/>
+        </w:tabs>
+        <w:ind w:left="3600" w:hanging="360"/>
+      </w:pPr>
+      <w:rPr>
+        <w:rFonts w:ascii="Wingdings" w:hAnsi="Wingdings" w:hint="default"/>
+        <w:sz w:val="20"/>
+      </w:rPr>
+    </w:lvl>
+    <w:lvl w:ilvl="5" w:tentative="1">
+      <w:start w:val="1"/>
+      <w:numFmt w:val="bullet"/>
+      <w:lvlText w:val=""/>
+      <w:lvlJc w:val="left"/>
+      <w:pPr>
+        <w:tabs>
+          <w:tab w:val="num" w:pos="4320"/>
+        </w:tabs>
+        <w:ind w:left="4320" w:hanging="360"/>
+      </w:pPr>
+      <w:rPr>
+        <w:rFonts w:ascii="Wingdings" w:hAnsi="Wingdings" w:hint="default"/>
+        <w:sz w:val="20"/>
+      </w:rPr>
+    </w:lvl>
+    <w:lvl w:ilvl="6" w:tentative="1">
+      <w:start w:val="1"/>
+      <w:numFmt w:val="bullet"/>
+      <w:lvlText w:val=""/>
+      <w:lvlJc w:val="left"/>
+      <w:pPr>
+        <w:tabs>
+          <w:tab w:val="num" w:pos="5040"/>
+        </w:tabs>
+        <w:ind w:left="5040" w:hanging="360"/>
+      </w:pPr>
+      <w:rPr>
+        <w:rFonts w:ascii="Wingdings" w:hAnsi="Wingdings" w:hint="default"/>
+        <w:sz w:val="20"/>
+      </w:rPr>
+    </w:lvl>
+    <w:lvl w:ilvl="7" w:tentative="1">
+      <w:start w:val="1"/>
+      <w:numFmt w:val="bullet"/>
+      <w:lvlText w:val=""/>
+      <w:lvlJc w:val="left"/>
+      <w:pPr>
+        <w:tabs>
+          <w:tab w:val="num" w:pos="5760"/>
+        </w:tabs>
+        <w:ind w:left="5760" w:hanging="360"/>
+      </w:pPr>
+      <w:rPr>
+        <w:rFonts w:ascii="Wingdings" w:hAnsi="Wingdings" w:hint="default"/>
+        <w:sz w:val="20"/>
+      </w:rPr>
+    </w:lvl>
+    <w:lvl w:ilvl="8" w:tentative="1">
+      <w:start w:val="1"/>
+      <w:numFmt w:val="bullet"/>
+      <w:lvlText w:val=""/>
+      <w:lvlJc w:val="left"/>
+      <w:pPr>
+        <w:tabs>
+          <w:tab w:val="num" w:pos="6480"/>
+        </w:tabs>
+        <w:ind w:left="6480" w:hanging="360"/>
+      </w:pPr>
+      <w:rPr>
+        <w:rFonts w:ascii="Wingdings" w:hAnsi="Wingdings" w:hint="default"/>
+        <w:sz w:val="20"/>
+      </w:rPr>
+    </w:lvl>
+  </w:abstractNum>
+  <w:abstractNum w:abstractNumId="8" w15:restartNumberingAfterBreak="0">
     <w:nsid w:val="25457FA3"/>
     <w:multiLevelType w:val="multilevel"/>
     <w:tmpl w:val="A7CE231C"/>
@@ -3524,7 +4564,7 @@
       </w:rPr>
     </w:lvl>
   </w:abstractNum>
-  <w:abstractNum w:abstractNumId="7" w15:restartNumberingAfterBreak="0">
+  <w:abstractNum w:abstractNumId="9" w15:restartNumberingAfterBreak="0">
     <w:nsid w:val="29A67B6E"/>
     <w:multiLevelType w:val="multilevel"/>
     <w:tmpl w:val="F81C0AF6"/>
@@ -3673,7 +4713,7 @@
       </w:rPr>
     </w:lvl>
   </w:abstractNum>
-  <w:abstractNum w:abstractNumId="8" w15:restartNumberingAfterBreak="0">
+  <w:abstractNum w:abstractNumId="10" w15:restartNumberingAfterBreak="0">
     <w:nsid w:val="2B965096"/>
     <w:multiLevelType w:val="multilevel"/>
     <w:tmpl w:val="CE2C0C96"/>
@@ -3822,7 +4862,7 @@
       </w:rPr>
     </w:lvl>
   </w:abstractNum>
-  <w:abstractNum w:abstractNumId="9" w15:restartNumberingAfterBreak="0">
+  <w:abstractNum w:abstractNumId="11" w15:restartNumberingAfterBreak="0">
     <w:nsid w:val="33673774"/>
     <w:multiLevelType w:val="hybridMultilevel"/>
     <w:tmpl w:val="3732CA38"/>
@@ -3911,7 +4951,7 @@
       </w:pPr>
     </w:lvl>
   </w:abstractNum>
-  <w:abstractNum w:abstractNumId="10" w15:restartNumberingAfterBreak="0">
+  <w:abstractNum w:abstractNumId="12" w15:restartNumberingAfterBreak="0">
     <w:nsid w:val="34C64A67"/>
     <w:multiLevelType w:val="hybridMultilevel"/>
     <w:tmpl w:val="1F86D06A"/>
@@ -4000,7 +5040,7 @@
       </w:pPr>
     </w:lvl>
   </w:abstractNum>
-  <w:abstractNum w:abstractNumId="11" w15:restartNumberingAfterBreak="0">
+  <w:abstractNum w:abstractNumId="13" w15:restartNumberingAfterBreak="0">
     <w:nsid w:val="3912206F"/>
     <w:multiLevelType w:val="multilevel"/>
     <w:tmpl w:val="BECC4B76"/>
@@ -4149,7 +5189,7 @@
       </w:rPr>
     </w:lvl>
   </w:abstractNum>
-  <w:abstractNum w:abstractNumId="12" w15:restartNumberingAfterBreak="0">
+  <w:abstractNum w:abstractNumId="14" w15:restartNumberingAfterBreak="0">
     <w:nsid w:val="3D466A4A"/>
     <w:multiLevelType w:val="multilevel"/>
     <w:tmpl w:val="C4B04AAA"/>
@@ -4298,7 +5338,7 @@
       </w:rPr>
     </w:lvl>
   </w:abstractNum>
-  <w:abstractNum w:abstractNumId="13" w15:restartNumberingAfterBreak="0">
+  <w:abstractNum w:abstractNumId="15" w15:restartNumberingAfterBreak="0">
     <w:nsid w:val="3D76094C"/>
     <w:multiLevelType w:val="multilevel"/>
     <w:tmpl w:val="D08631CA"/>
@@ -4385,7 +5425,7 @@
       </w:pPr>
     </w:lvl>
   </w:abstractNum>
-  <w:abstractNum w:abstractNumId="14" w15:restartNumberingAfterBreak="0">
+  <w:abstractNum w:abstractNumId="16" w15:restartNumberingAfterBreak="0">
     <w:nsid w:val="3FC1082B"/>
     <w:multiLevelType w:val="multilevel"/>
     <w:tmpl w:val="30628FA6"/>
@@ -4534,7 +5574,7 @@
       </w:rPr>
     </w:lvl>
   </w:abstractNum>
-  <w:abstractNum w:abstractNumId="15" w15:restartNumberingAfterBreak="0">
+  <w:abstractNum w:abstractNumId="17" w15:restartNumberingAfterBreak="0">
     <w:nsid w:val="440B184E"/>
     <w:multiLevelType w:val="multilevel"/>
     <w:tmpl w:val="C2968F0C"/>
@@ -4683,7 +5723,7 @@
       </w:rPr>
     </w:lvl>
   </w:abstractNum>
-  <w:abstractNum w:abstractNumId="16" w15:restartNumberingAfterBreak="0">
+  <w:abstractNum w:abstractNumId="18" w15:restartNumberingAfterBreak="0">
     <w:nsid w:val="44A65ADF"/>
     <w:multiLevelType w:val="multilevel"/>
     <w:tmpl w:val="E5628844"/>
@@ -4832,7 +5872,7 @@
       </w:rPr>
     </w:lvl>
   </w:abstractNum>
-  <w:abstractNum w:abstractNumId="17" w15:restartNumberingAfterBreak="0">
+  <w:abstractNum w:abstractNumId="19" w15:restartNumberingAfterBreak="0">
     <w:nsid w:val="48E81E96"/>
     <w:multiLevelType w:val="multilevel"/>
     <w:tmpl w:val="913EA57C"/>
@@ -4981,7 +6021,7 @@
       </w:rPr>
     </w:lvl>
   </w:abstractNum>
-  <w:abstractNum w:abstractNumId="18" w15:restartNumberingAfterBreak="0">
+  <w:abstractNum w:abstractNumId="20" w15:restartNumberingAfterBreak="0">
     <w:nsid w:val="4BC915B4"/>
     <w:multiLevelType w:val="multilevel"/>
     <w:tmpl w:val="FD6008B4"/>
@@ -5130,7 +6170,7 @@
       </w:rPr>
     </w:lvl>
   </w:abstractNum>
-  <w:abstractNum w:abstractNumId="19" w15:restartNumberingAfterBreak="0">
+  <w:abstractNum w:abstractNumId="21" w15:restartNumberingAfterBreak="0">
     <w:nsid w:val="4DC96C88"/>
     <w:multiLevelType w:val="multilevel"/>
     <w:tmpl w:val="BE820238"/>
@@ -5279,7 +6319,156 @@
       </w:rPr>
     </w:lvl>
   </w:abstractNum>
-  <w:abstractNum w:abstractNumId="20" w15:restartNumberingAfterBreak="0">
+  <w:abstractNum w:abstractNumId="22" w15:restartNumberingAfterBreak="0">
+    <w:nsid w:val="567916B7"/>
+    <w:multiLevelType w:val="multilevel"/>
+    <w:tmpl w:val="473AF72E"/>
+    <w:lvl w:ilvl="0">
+      <w:start w:val="1"/>
+      <w:numFmt w:val="bullet"/>
+      <w:lvlText w:val=""/>
+      <w:lvlJc w:val="left"/>
+      <w:pPr>
+        <w:tabs>
+          <w:tab w:val="num" w:pos="720"/>
+        </w:tabs>
+        <w:ind w:left="720" w:hanging="360"/>
+      </w:pPr>
+      <w:rPr>
+        <w:rFonts w:ascii="Symbol" w:hAnsi="Symbol" w:hint="default"/>
+        <w:sz w:val="20"/>
+      </w:rPr>
+    </w:lvl>
+    <w:lvl w:ilvl="1" w:tentative="1">
+      <w:start w:val="1"/>
+      <w:numFmt w:val="bullet"/>
+      <w:lvlText w:val="o"/>
+      <w:lvlJc w:val="left"/>
+      <w:pPr>
+        <w:tabs>
+          <w:tab w:val="num" w:pos="1440"/>
+        </w:tabs>
+        <w:ind w:left="1440" w:hanging="360"/>
+      </w:pPr>
+      <w:rPr>
+        <w:rFonts w:ascii="Courier New" w:hAnsi="Courier New" w:hint="default"/>
+        <w:sz w:val="20"/>
+      </w:rPr>
+    </w:lvl>
+    <w:lvl w:ilvl="2" w:tentative="1">
+      <w:start w:val="1"/>
+      <w:numFmt w:val="bullet"/>
+      <w:lvlText w:val=""/>
+      <w:lvlJc w:val="left"/>
+      <w:pPr>
+        <w:tabs>
+          <w:tab w:val="num" w:pos="2160"/>
+        </w:tabs>
+        <w:ind w:left="2160" w:hanging="360"/>
+      </w:pPr>
+      <w:rPr>
+        <w:rFonts w:ascii="Wingdings" w:hAnsi="Wingdings" w:hint="default"/>
+        <w:sz w:val="20"/>
+      </w:rPr>
+    </w:lvl>
+    <w:lvl w:ilvl="3" w:tentative="1">
+      <w:start w:val="1"/>
+      <w:numFmt w:val="bullet"/>
+      <w:lvlText w:val=""/>
+      <w:lvlJc w:val="left"/>
+      <w:pPr>
+        <w:tabs>
+          <w:tab w:val="num" w:pos="2880"/>
+        </w:tabs>
+        <w:ind w:left="2880" w:hanging="360"/>
+      </w:pPr>
+      <w:rPr>
+        <w:rFonts w:ascii="Wingdings" w:hAnsi="Wingdings" w:hint="default"/>
+        <w:sz w:val="20"/>
+      </w:rPr>
+    </w:lvl>
+    <w:lvl w:ilvl="4" w:tentative="1">
+      <w:start w:val="1"/>
+      <w:numFmt w:val="bullet"/>
+      <w:lvlText w:val=""/>
+      <w:lvlJc w:val="left"/>
+      <w:pPr>
+        <w:tabs>
+          <w:tab w:val="num" w:pos="3600"/>
+        </w:tabs>
+        <w:ind w:left="3600" w:hanging="360"/>
+      </w:pPr>
+      <w:rPr>
+        <w:rFonts w:ascii="Wingdings" w:hAnsi="Wingdings" w:hint="default"/>
+        <w:sz w:val="20"/>
+      </w:rPr>
+    </w:lvl>
+    <w:lvl w:ilvl="5" w:tentative="1">
+      <w:start w:val="1"/>
+      <w:numFmt w:val="bullet"/>
+      <w:lvlText w:val=""/>
+      <w:lvlJc w:val="left"/>
+      <w:pPr>
+        <w:tabs>
+          <w:tab w:val="num" w:pos="4320"/>
+        </w:tabs>
+        <w:ind w:left="4320" w:hanging="360"/>
+      </w:pPr>
+      <w:rPr>
+        <w:rFonts w:ascii="Wingdings" w:hAnsi="Wingdings" w:hint="default"/>
+        <w:sz w:val="20"/>
+      </w:rPr>
+    </w:lvl>
+    <w:lvl w:ilvl="6" w:tentative="1">
+      <w:start w:val="1"/>
+      <w:numFmt w:val="bullet"/>
+      <w:lvlText w:val=""/>
+      <w:lvlJc w:val="left"/>
+      <w:pPr>
+        <w:tabs>
+          <w:tab w:val="num" w:pos="5040"/>
+        </w:tabs>
+        <w:ind w:left="5040" w:hanging="360"/>
+      </w:pPr>
+      <w:rPr>
+        <w:rFonts w:ascii="Wingdings" w:hAnsi="Wingdings" w:hint="default"/>
+        <w:sz w:val="20"/>
+      </w:rPr>
+    </w:lvl>
+    <w:lvl w:ilvl="7" w:tentative="1">
+      <w:start w:val="1"/>
+      <w:numFmt w:val="bullet"/>
+      <w:lvlText w:val=""/>
+      <w:lvlJc w:val="left"/>
+      <w:pPr>
+        <w:tabs>
+          <w:tab w:val="num" w:pos="5760"/>
+        </w:tabs>
+        <w:ind w:left="5760" w:hanging="360"/>
+      </w:pPr>
+      <w:rPr>
+        <w:rFonts w:ascii="Wingdings" w:hAnsi="Wingdings" w:hint="default"/>
+        <w:sz w:val="20"/>
+      </w:rPr>
+    </w:lvl>
+    <w:lvl w:ilvl="8" w:tentative="1">
+      <w:start w:val="1"/>
+      <w:numFmt w:val="bullet"/>
+      <w:lvlText w:val=""/>
+      <w:lvlJc w:val="left"/>
+      <w:pPr>
+        <w:tabs>
+          <w:tab w:val="num" w:pos="6480"/>
+        </w:tabs>
+        <w:ind w:left="6480" w:hanging="360"/>
+      </w:pPr>
+      <w:rPr>
+        <w:rFonts w:ascii="Wingdings" w:hAnsi="Wingdings" w:hint="default"/>
+        <w:sz w:val="20"/>
+      </w:rPr>
+    </w:lvl>
+  </w:abstractNum>
+  <w:abstractNum w:abstractNumId="23" w15:restartNumberingAfterBreak="0">
     <w:nsid w:val="5B2262C7"/>
     <w:multiLevelType w:val="multilevel"/>
     <w:tmpl w:val="7CB2424E"/>
@@ -5428,7 +6617,7 @@
       </w:rPr>
     </w:lvl>
   </w:abstractNum>
-  <w:abstractNum w:abstractNumId="21" w15:restartNumberingAfterBreak="0">
+  <w:abstractNum w:abstractNumId="24" w15:restartNumberingAfterBreak="0">
     <w:nsid w:val="5D3D4386"/>
     <w:multiLevelType w:val="multilevel"/>
     <w:tmpl w:val="26F4B4C0"/>
@@ -5523,7 +6712,7 @@
       </w:pPr>
     </w:lvl>
   </w:abstractNum>
-  <w:abstractNum w:abstractNumId="22" w15:restartNumberingAfterBreak="0">
+  <w:abstractNum w:abstractNumId="25" w15:restartNumberingAfterBreak="0">
     <w:nsid w:val="5F057E9C"/>
     <w:multiLevelType w:val="multilevel"/>
     <w:tmpl w:val="197C323A"/>
@@ -5672,7 +6861,156 @@
       </w:rPr>
     </w:lvl>
   </w:abstractNum>
-  <w:abstractNum w:abstractNumId="23" w15:restartNumberingAfterBreak="0">
+  <w:abstractNum w:abstractNumId="26" w15:restartNumberingAfterBreak="0">
+    <w:nsid w:val="72D772FA"/>
+    <w:multiLevelType w:val="multilevel"/>
+    <w:tmpl w:val="54023AE4"/>
+    <w:lvl w:ilvl="0">
+      <w:start w:val="1"/>
+      <w:numFmt w:val="bullet"/>
+      <w:lvlText w:val=""/>
+      <w:lvlJc w:val="left"/>
+      <w:pPr>
+        <w:tabs>
+          <w:tab w:val="num" w:pos="1080"/>
+        </w:tabs>
+        <w:ind w:left="1080" w:hanging="360"/>
+      </w:pPr>
+      <w:rPr>
+        <w:rFonts w:ascii="Wingdings" w:hAnsi="Wingdings" w:hint="default"/>
+        <w:sz w:val="20"/>
+      </w:rPr>
+    </w:lvl>
+    <w:lvl w:ilvl="1" w:tentative="1">
+      <w:start w:val="1"/>
+      <w:numFmt w:val="bullet"/>
+      <w:lvlText w:val="o"/>
+      <w:lvlJc w:val="left"/>
+      <w:pPr>
+        <w:tabs>
+          <w:tab w:val="num" w:pos="1800"/>
+        </w:tabs>
+        <w:ind w:left="1800" w:hanging="360"/>
+      </w:pPr>
+      <w:rPr>
+        <w:rFonts w:ascii="Courier New" w:hAnsi="Courier New" w:hint="default"/>
+        <w:sz w:val="20"/>
+      </w:rPr>
+    </w:lvl>
+    <w:lvl w:ilvl="2" w:tentative="1">
+      <w:start w:val="1"/>
+      <w:numFmt w:val="bullet"/>
+      <w:lvlText w:val=""/>
+      <w:lvlJc w:val="left"/>
+      <w:pPr>
+        <w:tabs>
+          <w:tab w:val="num" w:pos="2520"/>
+        </w:tabs>
+        <w:ind w:left="2520" w:hanging="360"/>
+      </w:pPr>
+      <w:rPr>
+        <w:rFonts w:ascii="Wingdings" w:hAnsi="Wingdings" w:hint="default"/>
+        <w:sz w:val="20"/>
+      </w:rPr>
+    </w:lvl>
+    <w:lvl w:ilvl="3" w:tentative="1">
+      <w:start w:val="1"/>
+      <w:numFmt w:val="bullet"/>
+      <w:lvlText w:val=""/>
+      <w:lvlJc w:val="left"/>
+      <w:pPr>
+        <w:tabs>
+          <w:tab w:val="num" w:pos="3240"/>
+        </w:tabs>
+        <w:ind w:left="3240" w:hanging="360"/>
+      </w:pPr>
+      <w:rPr>
+        <w:rFonts w:ascii="Wingdings" w:hAnsi="Wingdings" w:hint="default"/>
+        <w:sz w:val="20"/>
+      </w:rPr>
+    </w:lvl>
+    <w:lvl w:ilvl="4" w:tentative="1">
+      <w:start w:val="1"/>
+      <w:numFmt w:val="bullet"/>
+      <w:lvlText w:val=""/>
+      <w:lvlJc w:val="left"/>
+      <w:pPr>
+        <w:tabs>
+          <w:tab w:val="num" w:pos="3960"/>
+        </w:tabs>
+        <w:ind w:left="3960" w:hanging="360"/>
+      </w:pPr>
+      <w:rPr>
+        <w:rFonts w:ascii="Wingdings" w:hAnsi="Wingdings" w:hint="default"/>
+        <w:sz w:val="20"/>
+      </w:rPr>
+    </w:lvl>
+    <w:lvl w:ilvl="5" w:tentative="1">
+      <w:start w:val="1"/>
+      <w:numFmt w:val="bullet"/>
+      <w:lvlText w:val=""/>
+      <w:lvlJc w:val="left"/>
+      <w:pPr>
+        <w:tabs>
+          <w:tab w:val="num" w:pos="4680"/>
+        </w:tabs>
+        <w:ind w:left="4680" w:hanging="360"/>
+      </w:pPr>
+      <w:rPr>
+        <w:rFonts w:ascii="Wingdings" w:hAnsi="Wingdings" w:hint="default"/>
+        <w:sz w:val="20"/>
+      </w:rPr>
+    </w:lvl>
+    <w:lvl w:ilvl="6" w:tentative="1">
+      <w:start w:val="1"/>
+      <w:numFmt w:val="bullet"/>
+      <w:lvlText w:val=""/>
+      <w:lvlJc w:val="left"/>
+      <w:pPr>
+        <w:tabs>
+          <w:tab w:val="num" w:pos="5400"/>
+        </w:tabs>
+        <w:ind w:left="5400" w:hanging="360"/>
+      </w:pPr>
+      <w:rPr>
+        <w:rFonts w:ascii="Wingdings" w:hAnsi="Wingdings" w:hint="default"/>
+        <w:sz w:val="20"/>
+      </w:rPr>
+    </w:lvl>
+    <w:lvl w:ilvl="7" w:tentative="1">
+      <w:start w:val="1"/>
+      <w:numFmt w:val="bullet"/>
+      <w:lvlText w:val=""/>
+      <w:lvlJc w:val="left"/>
+      <w:pPr>
+        <w:tabs>
+          <w:tab w:val="num" w:pos="6120"/>
+        </w:tabs>
+        <w:ind w:left="6120" w:hanging="360"/>
+      </w:pPr>
+      <w:rPr>
+        <w:rFonts w:ascii="Wingdings" w:hAnsi="Wingdings" w:hint="default"/>
+        <w:sz w:val="20"/>
+      </w:rPr>
+    </w:lvl>
+    <w:lvl w:ilvl="8" w:tentative="1">
+      <w:start w:val="1"/>
+      <w:numFmt w:val="bullet"/>
+      <w:lvlText w:val=""/>
+      <w:lvlJc w:val="left"/>
+      <w:pPr>
+        <w:tabs>
+          <w:tab w:val="num" w:pos="6840"/>
+        </w:tabs>
+        <w:ind w:left="6840" w:hanging="360"/>
+      </w:pPr>
+      <w:rPr>
+        <w:rFonts w:ascii="Wingdings" w:hAnsi="Wingdings" w:hint="default"/>
+        <w:sz w:val="20"/>
+      </w:rPr>
+    </w:lvl>
+  </w:abstractNum>
+  <w:abstractNum w:abstractNumId="27" w15:restartNumberingAfterBreak="0">
     <w:nsid w:val="734037CB"/>
     <w:multiLevelType w:val="hybridMultilevel"/>
     <w:tmpl w:val="6800381A"/>
@@ -5785,7 +7123,7 @@
       </w:rPr>
     </w:lvl>
   </w:abstractNum>
-  <w:abstractNum w:abstractNumId="24" w15:restartNumberingAfterBreak="0">
+  <w:abstractNum w:abstractNumId="28" w15:restartNumberingAfterBreak="0">
     <w:nsid w:val="76684CAC"/>
     <w:multiLevelType w:val="multilevel"/>
     <w:tmpl w:val="615ED27C"/>
@@ -5934,7 +7272,7 @@
       </w:rPr>
     </w:lvl>
   </w:abstractNum>
-  <w:abstractNum w:abstractNumId="25" w15:restartNumberingAfterBreak="0">
+  <w:abstractNum w:abstractNumId="29" w15:restartNumberingAfterBreak="0">
     <w:nsid w:val="76933778"/>
     <w:multiLevelType w:val="hybridMultilevel"/>
     <w:tmpl w:val="69045E28"/>
@@ -6048,85 +7386,97 @@
     </w:lvl>
   </w:abstractNum>
   <w:num w:numId="1" w16cid:durableId="2028940108">
-    <w:abstractNumId w:val="21"/>
+    <w:abstractNumId w:val="24"/>
   </w:num>
   <w:num w:numId="2" w16cid:durableId="1092821995">
-    <w:abstractNumId w:val="3"/>
+    <w:abstractNumId w:val="4"/>
   </w:num>
   <w:num w:numId="3" w16cid:durableId="597252673">
     <w:abstractNumId w:val="0"/>
   </w:num>
   <w:num w:numId="4" w16cid:durableId="1491943314">
-    <w:abstractNumId w:val="13"/>
+    <w:abstractNumId w:val="15"/>
   </w:num>
   <w:num w:numId="5" w16cid:durableId="1814909786">
-    <w:abstractNumId w:val="12"/>
+    <w:abstractNumId w:val="14"/>
   </w:num>
   <w:num w:numId="6" w16cid:durableId="322124996">
-    <w:abstractNumId w:val="22"/>
+    <w:abstractNumId w:val="25"/>
   </w:num>
   <w:num w:numId="7" w16cid:durableId="1324620755">
-    <w:abstractNumId w:val="24"/>
+    <w:abstractNumId w:val="28"/>
   </w:num>
   <w:num w:numId="8" w16cid:durableId="1826891123">
-    <w:abstractNumId w:val="7"/>
+    <w:abstractNumId w:val="9"/>
   </w:num>
   <w:num w:numId="9" w16cid:durableId="1009648126">
-    <w:abstractNumId w:val="19"/>
+    <w:abstractNumId w:val="21"/>
   </w:num>
   <w:num w:numId="10" w16cid:durableId="510686855">
-    <w:abstractNumId w:val="4"/>
+    <w:abstractNumId w:val="5"/>
   </w:num>
   <w:num w:numId="11" w16cid:durableId="133329584">
-    <w:abstractNumId w:val="20"/>
+    <w:abstractNumId w:val="23"/>
   </w:num>
   <w:num w:numId="12" w16cid:durableId="998656080">
     <w:abstractNumId w:val="2"/>
   </w:num>
   <w:num w:numId="13" w16cid:durableId="70474339">
+    <w:abstractNumId w:val="13"/>
+  </w:num>
+  <w:num w:numId="14" w16cid:durableId="2099477452">
+    <w:abstractNumId w:val="16"/>
+  </w:num>
+  <w:num w:numId="15" w16cid:durableId="1825663059">
+    <w:abstractNumId w:val="18"/>
+  </w:num>
+  <w:num w:numId="16" w16cid:durableId="432819340">
+    <w:abstractNumId w:val="17"/>
+  </w:num>
+  <w:num w:numId="17" w16cid:durableId="680742988">
+    <w:abstractNumId w:val="19"/>
+  </w:num>
+  <w:num w:numId="18" w16cid:durableId="1524629579">
+    <w:abstractNumId w:val="20"/>
+  </w:num>
+  <w:num w:numId="19" w16cid:durableId="1835611812">
+    <w:abstractNumId w:val="6"/>
+  </w:num>
+  <w:num w:numId="20" w16cid:durableId="1268804440">
+    <w:abstractNumId w:val="10"/>
+  </w:num>
+  <w:num w:numId="21" w16cid:durableId="547377171">
     <w:abstractNumId w:val="11"/>
   </w:num>
-  <w:num w:numId="14" w16cid:durableId="2099477452">
-    <w:abstractNumId w:val="14"/>
-  </w:num>
-  <w:num w:numId="15" w16cid:durableId="1825663059">
-    <w:abstractNumId w:val="16"/>
-  </w:num>
-  <w:num w:numId="16" w16cid:durableId="432819340">
-    <w:abstractNumId w:val="15"/>
-  </w:num>
-  <w:num w:numId="17" w16cid:durableId="680742988">
-    <w:abstractNumId w:val="17"/>
-  </w:num>
-  <w:num w:numId="18" w16cid:durableId="1524629579">
-    <w:abstractNumId w:val="18"/>
-  </w:num>
-  <w:num w:numId="19" w16cid:durableId="1835611812">
-    <w:abstractNumId w:val="5"/>
-  </w:num>
-  <w:num w:numId="20" w16cid:durableId="1268804440">
-    <w:abstractNumId w:val="8"/>
-  </w:num>
-  <w:num w:numId="21" w16cid:durableId="547377171">
-    <w:abstractNumId w:val="9"/>
-  </w:num>
   <w:num w:numId="22" w16cid:durableId="1147094581">
-    <w:abstractNumId w:val="21"/>
+    <w:abstractNumId w:val="24"/>
   </w:num>
   <w:num w:numId="23" w16cid:durableId="1451820990">
-    <w:abstractNumId w:val="10"/>
+    <w:abstractNumId w:val="12"/>
   </w:num>
   <w:num w:numId="24" w16cid:durableId="570116231">
-    <w:abstractNumId w:val="6"/>
+    <w:abstractNumId w:val="8"/>
   </w:num>
   <w:num w:numId="25" w16cid:durableId="327100088">
     <w:abstractNumId w:val="1"/>
   </w:num>
   <w:num w:numId="26" w16cid:durableId="561798373">
-    <w:abstractNumId w:val="25"/>
+    <w:abstractNumId w:val="29"/>
   </w:num>
   <w:num w:numId="27" w16cid:durableId="929239747">
-    <w:abstractNumId w:val="23"/>
+    <w:abstractNumId w:val="27"/>
+  </w:num>
+  <w:num w:numId="28" w16cid:durableId="560285441">
+    <w:abstractNumId w:val="22"/>
+  </w:num>
+  <w:num w:numId="29" w16cid:durableId="92871479">
+    <w:abstractNumId w:val="7"/>
+  </w:num>
+  <w:num w:numId="30" w16cid:durableId="1741517135">
+    <w:abstractNumId w:val="3"/>
+  </w:num>
+  <w:num w:numId="31" w16cid:durableId="878278965">
+    <w:abstractNumId w:val="26"/>
   </w:num>
   <w:numIdMacAtCleanup w:val="12"/>
 </w:numbering>
@@ -6713,6 +8063,7 @@
   <w:style w:type="character" w:default="1" w:styleId="Tipodeletrapredefinidodopargrafo">
     <w:name w:val="Default Paragraph Font"/>
     <w:uiPriority w:val="1"/>
+    <w:semiHidden/>
     <w:unhideWhenUsed/>
   </w:style>
   <w:style w:type="table" w:default="1" w:styleId="Tabelanormal">
@@ -8327,6 +9678,7 @@
     <w:rsid w:val="00126D84"/>
     <w:rsid w:val="00180903"/>
     <w:rsid w:val="001A4315"/>
+    <w:rsid w:val="001C2383"/>
     <w:rsid w:val="001E2633"/>
     <w:rsid w:val="00291EB4"/>
     <w:rsid w:val="002922A1"/>
@@ -8335,6 +9687,7 @@
     <w:rsid w:val="00361CED"/>
     <w:rsid w:val="0044123D"/>
     <w:rsid w:val="004E567A"/>
+    <w:rsid w:val="0054132A"/>
     <w:rsid w:val="0054729B"/>
     <w:rsid w:val="00575BE2"/>
     <w:rsid w:val="005A0706"/>
@@ -8360,6 +9713,7 @@
     <w:rsid w:val="00AF4C2E"/>
     <w:rsid w:val="00B3660F"/>
     <w:rsid w:val="00B533B1"/>
+    <w:rsid w:val="00B555C0"/>
     <w:rsid w:val="00B71466"/>
     <w:rsid w:val="00B92807"/>
     <w:rsid w:val="00BD2576"/>
@@ -8374,6 +9728,7 @@
     <w:rsid w:val="00EF30D4"/>
     <w:rsid w:val="00F05634"/>
     <w:rsid w:val="00F245FF"/>
+    <w:rsid w:val="00F30092"/>
     <w:rsid w:val="00FD5770"/>
   </w:rsids>
   <m:mathPr>

</xml_diff>